<commit_message>
docs: sync resources modeling, DB mapping, and endpoint matrix across design doc and PDF/Word
</commit_message>
<xml_diff>
--- a/Tugas_Minggu_4_Workshop_Desain_REST_API_Kelompok_3.docx
+++ b/Tugas_Minggu_4_Workshop_Desain_REST_API_Kelompok_3.docx
@@ -213,7 +213,7 @@
           <w:color w:val="1E3A8A"/>
           <w:sz w:val="22"/>
         </w:rPr>
-        <w:t>20.1 Aktivitas 1 – Pemodelan Resource (15 menit)</w:t>
+        <w:t>20.1 Aktivitas 1 – Pemodelan Resource (Koreksi &amp; Sinkronisasi Total)</w:t>
       </w:r>
     </w:p>
     <w:tbl>
@@ -223,16 +223,17 @@
         <w:tblLook w:firstColumn="1" w:firstRow="1" w:lastColumn="0" w:lastRow="0" w:noHBand="0" w:noVBand="1" w:val="04A0"/>
       </w:tblPr>
       <w:tblGrid>
-        <w:gridCol w:w="2102"/>
-        <w:gridCol w:w="2102"/>
-        <w:gridCol w:w="2102"/>
-        <w:gridCol w:w="2102"/>
-        <w:gridCol w:w="2102"/>
+        <w:gridCol w:w="1752"/>
+        <w:gridCol w:w="1752"/>
+        <w:gridCol w:w="1752"/>
+        <w:gridCol w:w="1752"/>
+        <w:gridCol w:w="1752"/>
+        <w:gridCol w:w="1752"/>
       </w:tblGrid>
       <w:tr>
         <w:tc>
           <w:tcPr>
-            <w:tcW w:type="dxa" w:w="2102"/>
+            <w:tcW w:type="dxa" w:w="1752"/>
             <w:shd w:fill="1E3A8A"/>
           </w:tcPr>
           <w:p>
@@ -243,7 +244,7 @@
               <w:rPr>
                 <w:b/>
                 <w:color w:val="FFFFFF"/>
-                <w:sz w:val="15"/>
+                <w:sz w:val="14"/>
               </w:rPr>
               <w:t>No</w:t>
             </w:r>
@@ -251,7 +252,7 @@
         </w:tc>
         <w:tc>
           <w:tcPr>
-            <w:tcW w:type="dxa" w:w="2102"/>
+            <w:tcW w:type="dxa" w:w="1752"/>
             <w:shd w:fill="1E3A8A"/>
           </w:tcPr>
           <w:p>
@@ -262,15 +263,15 @@
               <w:rPr>
                 <w:b/>
                 <w:color w:val="FFFFFF"/>
-                <w:sz w:val="15"/>
-              </w:rPr>
-              <w:t>Resource (Jamak)</w:t>
-            </w:r>
-          </w:p>
-        </w:tc>
-        <w:tc>
-          <w:tcPr>
-            <w:tcW w:type="dxa" w:w="2102"/>
+                <w:sz w:val="14"/>
+              </w:rPr>
+              <w:t>Resource URI</w:t>
+            </w:r>
+          </w:p>
+        </w:tc>
+        <w:tc>
+          <w:tcPr>
+            <w:tcW w:type="dxa" w:w="1752"/>
             <w:shd w:fill="1E3A8A"/>
           </w:tcPr>
           <w:p>
@@ -281,15 +282,15 @@
               <w:rPr>
                 <w:b/>
                 <w:color w:val="FFFFFF"/>
-                <w:sz w:val="15"/>
-              </w:rPr>
-              <w:t>Atribut Utama</w:t>
-            </w:r>
-          </w:p>
-        </w:tc>
-        <w:tc>
-          <w:tcPr>
-            <w:tcW w:type="dxa" w:w="2102"/>
+                <w:sz w:val="14"/>
+              </w:rPr>
+              <w:t>Tabel DB</w:t>
+            </w:r>
+          </w:p>
+        </w:tc>
+        <w:tc>
+          <w:tcPr>
+            <w:tcW w:type="dxa" w:w="1752"/>
             <w:shd w:fill="1E3A8A"/>
           </w:tcPr>
           <w:p>
@@ -300,15 +301,15 @@
               <w:rPr>
                 <w:b/>
                 <w:color w:val="FFFFFF"/>
-                <w:sz w:val="15"/>
-              </w:rPr>
-              <w:t>Relasi Antar Entitas</w:t>
-            </w:r>
-          </w:p>
-        </w:tc>
-        <w:tc>
-          <w:tcPr>
-            <w:tcW w:type="dxa" w:w="2102"/>
+                <w:sz w:val="14"/>
+              </w:rPr>
+              <w:t>Atribut Utama</w:t>
+            </w:r>
+          </w:p>
+        </w:tc>
+        <w:tc>
+          <w:tcPr>
+            <w:tcW w:type="dxa" w:w="1752"/>
             <w:shd w:fill="1E3A8A"/>
           </w:tcPr>
           <w:p>
@@ -319,7 +320,26 @@
               <w:rPr>
                 <w:b/>
                 <w:color w:val="FFFFFF"/>
-                <w:sz w:val="15"/>
+                <w:sz w:val="14"/>
+              </w:rPr>
+              <w:t>Relasi Antar Entitas</w:t>
+            </w:r>
+          </w:p>
+        </w:tc>
+        <w:tc>
+          <w:tcPr>
+            <w:tcW w:type="dxa" w:w="1752"/>
+            <w:shd w:fill="1E3A8A"/>
+          </w:tcPr>
+          <w:p>
+            <w:pPr>
+              <w:spacing w:after="20" w:before="20"/>
+            </w:pPr>
+            <w:r>
+              <w:rPr>
+                <w:b/>
+                <w:color w:val="FFFFFF"/>
+                <w:sz w:val="14"/>
               </w:rPr>
               <w:t>Jenis Resource</w:t>
             </w:r>
@@ -329,7 +349,7 @@
       <w:tr>
         <w:tc>
           <w:tcPr>
-            <w:tcW w:type="dxa" w:w="2102"/>
+            <w:tcW w:type="dxa" w:w="1752"/>
             <w:shd w:fill="FFFFFF"/>
           </w:tcPr>
           <w:p>
@@ -338,7 +358,7 @@
             </w:pPr>
             <w:r>
               <w:rPr>
-                <w:sz w:val="15"/>
+                <w:sz w:val="14"/>
               </w:rPr>
               <w:t>1</w:t>
             </w:r>
@@ -346,7 +366,7 @@
         </w:tc>
         <w:tc>
           <w:tcPr>
-            <w:tcW w:type="dxa" w:w="2102"/>
+            <w:tcW w:type="dxa" w:w="1752"/>
             <w:shd w:fill="FFFFFF"/>
           </w:tcPr>
           <w:p>
@@ -355,15 +375,15 @@
             </w:pPr>
             <w:r>
               <w:rPr>
-                <w:sz w:val="15"/>
-              </w:rPr>
-              <w:t>venues</w:t>
-            </w:r>
-          </w:p>
-        </w:tc>
-        <w:tc>
-          <w:tcPr>
-            <w:tcW w:type="dxa" w:w="2102"/>
+                <w:sz w:val="14"/>
+              </w:rPr>
+              <w:t>users</w:t>
+            </w:r>
+          </w:p>
+        </w:tc>
+        <w:tc>
+          <w:tcPr>
+            <w:tcW w:type="dxa" w:w="1752"/>
             <w:shd w:fill="FFFFFF"/>
           </w:tcPr>
           <w:p>
@@ -372,15 +392,15 @@
             </w:pPr>
             <w:r>
               <w:rPr>
-                <w:sz w:val="15"/>
-              </w:rPr>
-              <w:t>id, owner_id, name, slug, address, city, phone, dp_percent, cancel_free_hours, cancel_refund_percent, is_active</w:t>
-            </w:r>
-          </w:p>
-        </w:tc>
-        <w:tc>
-          <w:tcPr>
-            <w:tcW w:type="dxa" w:w="2102"/>
+                <w:sz w:val="14"/>
+              </w:rPr>
+              <w:t>users</w:t>
+            </w:r>
+          </w:p>
+        </w:tc>
+        <w:tc>
+          <w:tcPr>
+            <w:tcW w:type="dxa" w:w="1752"/>
             <w:shd w:fill="FFFFFF"/>
           </w:tcPr>
           <w:p>
@@ -389,17 +409,34 @@
             </w:pPr>
             <w:r>
               <w:rPr>
-                <w:sz w:val="15"/>
-              </w:rPr>
-              <w:t>1 : N ke courts</w:t>
+                <w:sz w:val="14"/>
+              </w:rPr>
+              <w:t>id, name, email, phone, role, status, email_verified_at, created_at</w:t>
+            </w:r>
+          </w:p>
+        </w:tc>
+        <w:tc>
+          <w:tcPr>
+            <w:tcW w:type="dxa" w:w="1752"/>
+            <w:shd w:fill="FFFFFF"/>
+          </w:tcPr>
+          <w:p>
+            <w:pPr>
+              <w:spacing w:after="20" w:before="20"/>
+            </w:pPr>
+            <w:r>
+              <w:rPr>
+                <w:sz w:val="14"/>
+              </w:rPr>
+              <w:t>1 : N ke venues (pengelola)</w:t>
               <w:br/>
-              <w:t>N : 1 ke users (owner)</w:t>
-            </w:r>
-          </w:p>
-        </w:tc>
-        <w:tc>
-          <w:tcPr>
-            <w:tcW w:type="dxa" w:w="2102"/>
+              <w:t>1 : N ke bookings (penyewa)</w:t>
+            </w:r>
+          </w:p>
+        </w:tc>
+        <w:tc>
+          <w:tcPr>
+            <w:tcW w:type="dxa" w:w="1752"/>
             <w:shd w:fill="FFFFFF"/>
           </w:tcPr>
           <w:p>
@@ -408,7 +445,7 @@
             </w:pPr>
             <w:r>
               <w:rPr>
-                <w:sz w:val="15"/>
+                <w:sz w:val="14"/>
               </w:rPr>
               <w:t>Collection</w:t>
             </w:r>
@@ -418,7 +455,7 @@
       <w:tr>
         <w:tc>
           <w:tcPr>
-            <w:tcW w:type="dxa" w:w="2102"/>
+            <w:tcW w:type="dxa" w:w="1752"/>
             <w:shd w:fill="F8FAFC"/>
           </w:tcPr>
           <w:p>
@@ -427,7 +464,7 @@
             </w:pPr>
             <w:r>
               <w:rPr>
-                <w:sz w:val="15"/>
+                <w:sz w:val="14"/>
               </w:rPr>
               <w:t>2</w:t>
             </w:r>
@@ -435,7 +472,7 @@
         </w:tc>
         <w:tc>
           <w:tcPr>
-            <w:tcW w:type="dxa" w:w="2102"/>
+            <w:tcW w:type="dxa" w:w="1752"/>
             <w:shd w:fill="F8FAFC"/>
           </w:tcPr>
           <w:p>
@@ -444,7 +481,113 @@
             </w:pPr>
             <w:r>
               <w:rPr>
-                <w:sz w:val="15"/>
+                <w:sz w:val="14"/>
+              </w:rPr>
+              <w:t>venues</w:t>
+            </w:r>
+          </w:p>
+        </w:tc>
+        <w:tc>
+          <w:tcPr>
+            <w:tcW w:type="dxa" w:w="1752"/>
+            <w:shd w:fill="F8FAFC"/>
+          </w:tcPr>
+          <w:p>
+            <w:pPr>
+              <w:spacing w:after="20" w:before="20"/>
+            </w:pPr>
+            <w:r>
+              <w:rPr>
+                <w:sz w:val="14"/>
+              </w:rPr>
+              <w:t>venues</w:t>
+            </w:r>
+          </w:p>
+        </w:tc>
+        <w:tc>
+          <w:tcPr>
+            <w:tcW w:type="dxa" w:w="1752"/>
+            <w:shd w:fill="F8FAFC"/>
+          </w:tcPr>
+          <w:p>
+            <w:pPr>
+              <w:spacing w:after="20" w:before="20"/>
+            </w:pPr>
+            <w:r>
+              <w:rPr>
+                <w:sz w:val="14"/>
+              </w:rPr>
+              <w:t>id, owner_id, name, slug, address, city, phone, dp_percent, cancel_free_hours, cancel_refund_percent, is_active</w:t>
+            </w:r>
+          </w:p>
+        </w:tc>
+        <w:tc>
+          <w:tcPr>
+            <w:tcW w:type="dxa" w:w="1752"/>
+            <w:shd w:fill="F8FAFC"/>
+          </w:tcPr>
+          <w:p>
+            <w:pPr>
+              <w:spacing w:after="20" w:before="20"/>
+            </w:pPr>
+            <w:r>
+              <w:rPr>
+                <w:sz w:val="14"/>
+              </w:rPr>
+              <w:t>N : 1 ke users (owner)</w:t>
+              <w:br/>
+              <w:t>1 : N ke courts</w:t>
+            </w:r>
+          </w:p>
+        </w:tc>
+        <w:tc>
+          <w:tcPr>
+            <w:tcW w:type="dxa" w:w="1752"/>
+            <w:shd w:fill="F8FAFC"/>
+          </w:tcPr>
+          <w:p>
+            <w:pPr>
+              <w:spacing w:after="20" w:before="20"/>
+            </w:pPr>
+            <w:r>
+              <w:rPr>
+                <w:sz w:val="14"/>
+              </w:rPr>
+              <w:t>Collection</w:t>
+            </w:r>
+          </w:p>
+        </w:tc>
+      </w:tr>
+      <w:tr>
+        <w:tc>
+          <w:tcPr>
+            <w:tcW w:type="dxa" w:w="1752"/>
+            <w:shd w:fill="FFFFFF"/>
+          </w:tcPr>
+          <w:p>
+            <w:pPr>
+              <w:spacing w:after="20" w:before="20"/>
+            </w:pPr>
+            <w:r>
+              <w:rPr>
+                <w:sz w:val="14"/>
+              </w:rPr>
+              <w:t>3</w:t>
+            </w:r>
+          </w:p>
+        </w:tc>
+        <w:tc>
+          <w:tcPr>
+            <w:tcW w:type="dxa" w:w="1752"/>
+            <w:shd w:fill="FFFFFF"/>
+          </w:tcPr>
+          <w:p>
+            <w:pPr>
+              <w:spacing w:after="20" w:before="20"/>
+            </w:pPr>
+            <w:r>
+              <w:rPr>
+                <w:sz w:val="14"/>
               </w:rPr>
               <w:t>courts</w:t>
             </w:r>
@@ -452,52 +595,69 @@
         </w:tc>
         <w:tc>
           <w:tcPr>
-            <w:tcW w:type="dxa" w:w="2102"/>
-            <w:shd w:fill="F8FAFC"/>
-          </w:tcPr>
-          <w:p>
-            <w:pPr>
-              <w:spacing w:after="20" w:before="20"/>
-            </w:pPr>
-            <w:r>
-              <w:rPr>
-                <w:sz w:val="15"/>
-              </w:rPr>
-              <w:t>id, venue_id, name, sport_type, surface, capacity_players, is_active</w:t>
-            </w:r>
-          </w:p>
-        </w:tc>
-        <w:tc>
-          <w:tcPr>
-            <w:tcW w:type="dxa" w:w="2102"/>
-            <w:shd w:fill="F8FAFC"/>
-          </w:tcPr>
-          <w:p>
-            <w:pPr>
-              <w:spacing w:after="20" w:before="20"/>
-            </w:pPr>
-            <w:r>
-              <w:rPr>
-                <w:sz w:val="15"/>
+            <w:tcW w:type="dxa" w:w="1752"/>
+            <w:shd w:fill="FFFFFF"/>
+          </w:tcPr>
+          <w:p>
+            <w:pPr>
+              <w:spacing w:after="20" w:before="20"/>
+            </w:pPr>
+            <w:r>
+              <w:rPr>
+                <w:sz w:val="14"/>
+              </w:rPr>
+              <w:t>courts</w:t>
+            </w:r>
+          </w:p>
+        </w:tc>
+        <w:tc>
+          <w:tcPr>
+            <w:tcW w:type="dxa" w:w="1752"/>
+            <w:shd w:fill="FFFFFF"/>
+          </w:tcPr>
+          <w:p>
+            <w:pPr>
+              <w:spacing w:after="20" w:before="20"/>
+            </w:pPr>
+            <w:r>
+              <w:rPr>
+                <w:sz w:val="14"/>
+              </w:rPr>
+              <w:t>id, venue_id, name, sport_type, is_active, created_at</w:t>
+            </w:r>
+          </w:p>
+        </w:tc>
+        <w:tc>
+          <w:tcPr>
+            <w:tcW w:type="dxa" w:w="1752"/>
+            <w:shd w:fill="FFFFFF"/>
+          </w:tcPr>
+          <w:p>
+            <w:pPr>
+              <w:spacing w:after="20" w:before="20"/>
+            </w:pPr>
+            <w:r>
+              <w:rPr>
+                <w:sz w:val="14"/>
               </w:rPr>
               <w:t>N : 1 ke venues</w:t>
               <w:br/>
-              <w:t>1 : N ke court_prices, operating_hours, bookings</w:t>
-            </w:r>
-          </w:p>
-        </w:tc>
-        <w:tc>
-          <w:tcPr>
-            <w:tcW w:type="dxa" w:w="2102"/>
-            <w:shd w:fill="F8FAFC"/>
-          </w:tcPr>
-          <w:p>
-            <w:pPr>
-              <w:spacing w:after="20" w:before="20"/>
-            </w:pPr>
-            <w:r>
-              <w:rPr>
-                <w:sz w:val="15"/>
+              <w:t>1 : N ke prices, operating-hours, blocks, bookings</w:t>
+            </w:r>
+          </w:p>
+        </w:tc>
+        <w:tc>
+          <w:tcPr>
+            <w:tcW w:type="dxa" w:w="1752"/>
+            <w:shd w:fill="FFFFFF"/>
+          </w:tcPr>
+          <w:p>
+            <w:pPr>
+              <w:spacing w:after="20" w:before="20"/>
+            </w:pPr>
+            <w:r>
+              <w:rPr>
+                <w:sz w:val="14"/>
               </w:rPr>
               <w:t>Sub-resource / Collection</w:t>
             </w:r>
@@ -507,33 +667,50 @@
       <w:tr>
         <w:tc>
           <w:tcPr>
-            <w:tcW w:type="dxa" w:w="2102"/>
-            <w:shd w:fill="FFFFFF"/>
-          </w:tcPr>
-          <w:p>
-            <w:pPr>
-              <w:spacing w:after="20" w:before="20"/>
-            </w:pPr>
-            <w:r>
-              <w:rPr>
-                <w:sz w:val="15"/>
-              </w:rPr>
-              <w:t>3</w:t>
-            </w:r>
-          </w:p>
-        </w:tc>
-        <w:tc>
-          <w:tcPr>
-            <w:tcW w:type="dxa" w:w="2102"/>
-            <w:shd w:fill="FFFFFF"/>
-          </w:tcPr>
-          <w:p>
-            <w:pPr>
-              <w:spacing w:after="20" w:before="20"/>
-            </w:pPr>
-            <w:r>
-              <w:rPr>
-                <w:sz w:val="15"/>
+            <w:tcW w:type="dxa" w:w="1752"/>
+            <w:shd w:fill="F8FAFC"/>
+          </w:tcPr>
+          <w:p>
+            <w:pPr>
+              <w:spacing w:after="20" w:before="20"/>
+            </w:pPr>
+            <w:r>
+              <w:rPr>
+                <w:sz w:val="14"/>
+              </w:rPr>
+              <w:t>4</w:t>
+            </w:r>
+          </w:p>
+        </w:tc>
+        <w:tc>
+          <w:tcPr>
+            <w:tcW w:type="dxa" w:w="1752"/>
+            <w:shd w:fill="F8FAFC"/>
+          </w:tcPr>
+          <w:p>
+            <w:pPr>
+              <w:spacing w:after="20" w:before="20"/>
+            </w:pPr>
+            <w:r>
+              <w:rPr>
+                <w:sz w:val="14"/>
+              </w:rPr>
+              <w:t>prices</w:t>
+            </w:r>
+          </w:p>
+        </w:tc>
+        <w:tc>
+          <w:tcPr>
+            <w:tcW w:type="dxa" w:w="1752"/>
+            <w:shd w:fill="F8FAFC"/>
+          </w:tcPr>
+          <w:p>
+            <w:pPr>
+              <w:spacing w:after="20" w:before="20"/>
+            </w:pPr>
+            <w:r>
+              <w:rPr>
+                <w:sz w:val="14"/>
               </w:rPr>
               <w:t>court_prices</w:t>
             </w:r>
@@ -541,33 +718,33 @@
         </w:tc>
         <w:tc>
           <w:tcPr>
-            <w:tcW w:type="dxa" w:w="2102"/>
-            <w:shd w:fill="FFFFFF"/>
-          </w:tcPr>
-          <w:p>
-            <w:pPr>
-              <w:spacing w:after="20" w:before="20"/>
-            </w:pPr>
-            <w:r>
-              <w:rPr>
-                <w:sz w:val="15"/>
-              </w:rPr>
-              <w:t>id, court_id, day_type, start_time, end_time, price, label</w:t>
-            </w:r>
-          </w:p>
-        </w:tc>
-        <w:tc>
-          <w:tcPr>
-            <w:tcW w:type="dxa" w:w="2102"/>
-            <w:shd w:fill="FFFFFF"/>
-          </w:tcPr>
-          <w:p>
-            <w:pPr>
-              <w:spacing w:after="20" w:before="20"/>
-            </w:pPr>
-            <w:r>
-              <w:rPr>
-                <w:sz w:val="15"/>
+            <w:tcW w:type="dxa" w:w="1752"/>
+            <w:shd w:fill="F8FAFC"/>
+          </w:tcPr>
+          <w:p>
+            <w:pPr>
+              <w:spacing w:after="20" w:before="20"/>
+            </w:pPr>
+            <w:r>
+              <w:rPr>
+                <w:sz w:val="14"/>
+              </w:rPr>
+              <w:t>id, court_id, day_type, start_time, end_time, price</w:t>
+            </w:r>
+          </w:p>
+        </w:tc>
+        <w:tc>
+          <w:tcPr>
+            <w:tcW w:type="dxa" w:w="1752"/>
+            <w:shd w:fill="F8FAFC"/>
+          </w:tcPr>
+          <w:p>
+            <w:pPr>
+              <w:spacing w:after="20" w:before="20"/>
+            </w:pPr>
+            <w:r>
+              <w:rPr>
+                <w:sz w:val="14"/>
               </w:rPr>
               <w:t>N : 1 ke courts</w:t>
             </w:r>
@@ -575,16 +752,16 @@
         </w:tc>
         <w:tc>
           <w:tcPr>
-            <w:tcW w:type="dxa" w:w="2102"/>
-            <w:shd w:fill="FFFFFF"/>
-          </w:tcPr>
-          <w:p>
-            <w:pPr>
-              <w:spacing w:after="20" w:before="20"/>
-            </w:pPr>
-            <w:r>
-              <w:rPr>
-                <w:sz w:val="15"/>
+            <w:tcW w:type="dxa" w:w="1752"/>
+            <w:shd w:fill="F8FAFC"/>
+          </w:tcPr>
+          <w:p>
+            <w:pPr>
+              <w:spacing w:after="20" w:before="20"/>
+            </w:pPr>
+            <w:r>
+              <w:rPr>
+                <w:sz w:val="14"/>
               </w:rPr>
               <w:t>Sub-resource</w:t>
             </w:r>
@@ -594,33 +771,50 @@
       <w:tr>
         <w:tc>
           <w:tcPr>
-            <w:tcW w:type="dxa" w:w="2102"/>
-            <w:shd w:fill="F8FAFC"/>
-          </w:tcPr>
-          <w:p>
-            <w:pPr>
-              <w:spacing w:after="20" w:before="20"/>
-            </w:pPr>
-            <w:r>
-              <w:rPr>
-                <w:sz w:val="15"/>
-              </w:rPr>
-              <w:t>4</w:t>
-            </w:r>
-          </w:p>
-        </w:tc>
-        <w:tc>
-          <w:tcPr>
-            <w:tcW w:type="dxa" w:w="2102"/>
-            <w:shd w:fill="F8FAFC"/>
-          </w:tcPr>
-          <w:p>
-            <w:pPr>
-              <w:spacing w:after="20" w:before="20"/>
-            </w:pPr>
-            <w:r>
-              <w:rPr>
-                <w:sz w:val="15"/>
+            <w:tcW w:type="dxa" w:w="1752"/>
+            <w:shd w:fill="FFFFFF"/>
+          </w:tcPr>
+          <w:p>
+            <w:pPr>
+              <w:spacing w:after="20" w:before="20"/>
+            </w:pPr>
+            <w:r>
+              <w:rPr>
+                <w:sz w:val="14"/>
+              </w:rPr>
+              <w:t>5</w:t>
+            </w:r>
+          </w:p>
+        </w:tc>
+        <w:tc>
+          <w:tcPr>
+            <w:tcW w:type="dxa" w:w="1752"/>
+            <w:shd w:fill="FFFFFF"/>
+          </w:tcPr>
+          <w:p>
+            <w:pPr>
+              <w:spacing w:after="20" w:before="20"/>
+            </w:pPr>
+            <w:r>
+              <w:rPr>
+                <w:sz w:val="14"/>
+              </w:rPr>
+              <w:t>operating-hours</w:t>
+            </w:r>
+          </w:p>
+        </w:tc>
+        <w:tc>
+          <w:tcPr>
+            <w:tcW w:type="dxa" w:w="1752"/>
+            <w:shd w:fill="FFFFFF"/>
+          </w:tcPr>
+          <w:p>
+            <w:pPr>
+              <w:spacing w:after="20" w:before="20"/>
+            </w:pPr>
+            <w:r>
+              <w:rPr>
+                <w:sz w:val="14"/>
               </w:rPr>
               <w:t>operating_hours</w:t>
             </w:r>
@@ -628,33 +822,33 @@
         </w:tc>
         <w:tc>
           <w:tcPr>
-            <w:tcW w:type="dxa" w:w="2102"/>
-            <w:shd w:fill="F8FAFC"/>
-          </w:tcPr>
-          <w:p>
-            <w:pPr>
-              <w:spacing w:after="20" w:before="20"/>
-            </w:pPr>
-            <w:r>
-              <w:rPr>
-                <w:sz w:val="15"/>
-              </w:rPr>
-              <w:t>id, court_id, day_of_week, open_time, close_time, is_closed</w:t>
-            </w:r>
-          </w:p>
-        </w:tc>
-        <w:tc>
-          <w:tcPr>
-            <w:tcW w:type="dxa" w:w="2102"/>
-            <w:shd w:fill="F8FAFC"/>
-          </w:tcPr>
-          <w:p>
-            <w:pPr>
-              <w:spacing w:after="20" w:before="20"/>
-            </w:pPr>
-            <w:r>
-              <w:rPr>
-                <w:sz w:val="15"/>
+            <w:tcW w:type="dxa" w:w="1752"/>
+            <w:shd w:fill="FFFFFF"/>
+          </w:tcPr>
+          <w:p>
+            <w:pPr>
+              <w:spacing w:after="20" w:before="20"/>
+            </w:pPr>
+            <w:r>
+              <w:rPr>
+                <w:sz w:val="14"/>
+              </w:rPr>
+              <w:t>id, court_id, day_of_week, open_time, close_time, slot_duration_minutes</w:t>
+            </w:r>
+          </w:p>
+        </w:tc>
+        <w:tc>
+          <w:tcPr>
+            <w:tcW w:type="dxa" w:w="1752"/>
+            <w:shd w:fill="FFFFFF"/>
+          </w:tcPr>
+          <w:p>
+            <w:pPr>
+              <w:spacing w:after="20" w:before="20"/>
+            </w:pPr>
+            <w:r>
+              <w:rPr>
+                <w:sz w:val="14"/>
               </w:rPr>
               <w:t>N : 1 ke courts</w:t>
             </w:r>
@@ -662,16 +856,16 @@
         </w:tc>
         <w:tc>
           <w:tcPr>
-            <w:tcW w:type="dxa" w:w="2102"/>
-            <w:shd w:fill="F8FAFC"/>
-          </w:tcPr>
-          <w:p>
-            <w:pPr>
-              <w:spacing w:after="20" w:before="20"/>
-            </w:pPr>
-            <w:r>
-              <w:rPr>
-                <w:sz w:val="15"/>
+            <w:tcW w:type="dxa" w:w="1752"/>
+            <w:shd w:fill="FFFFFF"/>
+          </w:tcPr>
+          <w:p>
+            <w:pPr>
+              <w:spacing w:after="20" w:before="20"/>
+            </w:pPr>
+            <w:r>
+              <w:rPr>
+                <w:sz w:val="14"/>
               </w:rPr>
               <w:t>Sub-resource</w:t>
             </w:r>
@@ -681,33 +875,50 @@
       <w:tr>
         <w:tc>
           <w:tcPr>
-            <w:tcW w:type="dxa" w:w="2102"/>
-            <w:shd w:fill="FFFFFF"/>
-          </w:tcPr>
-          <w:p>
-            <w:pPr>
-              <w:spacing w:after="20" w:before="20"/>
-            </w:pPr>
-            <w:r>
-              <w:rPr>
-                <w:sz w:val="15"/>
-              </w:rPr>
-              <w:t>5</w:t>
-            </w:r>
-          </w:p>
-        </w:tc>
-        <w:tc>
-          <w:tcPr>
-            <w:tcW w:type="dxa" w:w="2102"/>
-            <w:shd w:fill="FFFFFF"/>
-          </w:tcPr>
-          <w:p>
-            <w:pPr>
-              <w:spacing w:after="20" w:before="20"/>
-            </w:pPr>
-            <w:r>
-              <w:rPr>
-                <w:sz w:val="15"/>
+            <w:tcW w:type="dxa" w:w="1752"/>
+            <w:shd w:fill="F8FAFC"/>
+          </w:tcPr>
+          <w:p>
+            <w:pPr>
+              <w:spacing w:after="20" w:before="20"/>
+            </w:pPr>
+            <w:r>
+              <w:rPr>
+                <w:sz w:val="14"/>
+              </w:rPr>
+              <w:t>6</w:t>
+            </w:r>
+          </w:p>
+        </w:tc>
+        <w:tc>
+          <w:tcPr>
+            <w:tcW w:type="dxa" w:w="1752"/>
+            <w:shd w:fill="F8FAFC"/>
+          </w:tcPr>
+          <w:p>
+            <w:pPr>
+              <w:spacing w:after="20" w:before="20"/>
+            </w:pPr>
+            <w:r>
+              <w:rPr>
+                <w:sz w:val="14"/>
+              </w:rPr>
+              <w:t>blocks</w:t>
+            </w:r>
+          </w:p>
+        </w:tc>
+        <w:tc>
+          <w:tcPr>
+            <w:tcW w:type="dxa" w:w="1752"/>
+            <w:shd w:fill="F8FAFC"/>
+          </w:tcPr>
+          <w:p>
+            <w:pPr>
+              <w:spacing w:after="20" w:before="20"/>
+            </w:pPr>
+            <w:r>
+              <w:rPr>
+                <w:sz w:val="14"/>
               </w:rPr>
               <w:t>schedule_blocks</w:t>
             </w:r>
@@ -715,52 +926,50 @@
         </w:tc>
         <w:tc>
           <w:tcPr>
-            <w:tcW w:type="dxa" w:w="2102"/>
-            <w:shd w:fill="FFFFFF"/>
-          </w:tcPr>
-          <w:p>
-            <w:pPr>
-              <w:spacing w:after="20" w:before="20"/>
-            </w:pPr>
-            <w:r>
-              <w:rPr>
-                <w:sz w:val="15"/>
-              </w:rPr>
-              <w:t>id, court_id, start_at, end_at, block_type, reason, created_by</w:t>
-            </w:r>
-          </w:p>
-        </w:tc>
-        <w:tc>
-          <w:tcPr>
-            <w:tcW w:type="dxa" w:w="2102"/>
-            <w:shd w:fill="FFFFFF"/>
-          </w:tcPr>
-          <w:p>
-            <w:pPr>
-              <w:spacing w:after="20" w:before="20"/>
-            </w:pPr>
-            <w:r>
-              <w:rPr>
-                <w:sz w:val="15"/>
+            <w:tcW w:type="dxa" w:w="1752"/>
+            <w:shd w:fill="F8FAFC"/>
+          </w:tcPr>
+          <w:p>
+            <w:pPr>
+              <w:spacing w:after="20" w:before="20"/>
+            </w:pPr>
+            <w:r>
+              <w:rPr>
+                <w:sz w:val="14"/>
+              </w:rPr>
+              <w:t>id, court_id, start_at, end_at, reason, created_at</w:t>
+            </w:r>
+          </w:p>
+        </w:tc>
+        <w:tc>
+          <w:tcPr>
+            <w:tcW w:type="dxa" w:w="1752"/>
+            <w:shd w:fill="F8FAFC"/>
+          </w:tcPr>
+          <w:p>
+            <w:pPr>
+              <w:spacing w:after="20" w:before="20"/>
+            </w:pPr>
+            <w:r>
+              <w:rPr>
+                <w:sz w:val="14"/>
               </w:rPr>
               <w:t>N : 1 ke courts</w:t>
-              <w:br/>
-              <w:t>N : 1 ke users</w:t>
-            </w:r>
-          </w:p>
-        </w:tc>
-        <w:tc>
-          <w:tcPr>
-            <w:tcW w:type="dxa" w:w="2102"/>
-            <w:shd w:fill="FFFFFF"/>
-          </w:tcPr>
-          <w:p>
-            <w:pPr>
-              <w:spacing w:after="20" w:before="20"/>
-            </w:pPr>
-            <w:r>
-              <w:rPr>
-                <w:sz w:val="15"/>
+            </w:r>
+          </w:p>
+        </w:tc>
+        <w:tc>
+          <w:tcPr>
+            <w:tcW w:type="dxa" w:w="1752"/>
+            <w:shd w:fill="F8FAFC"/>
+          </w:tcPr>
+          <w:p>
+            <w:pPr>
+              <w:spacing w:after="20" w:before="20"/>
+            </w:pPr>
+            <w:r>
+              <w:rPr>
+                <w:sz w:val="14"/>
               </w:rPr>
               <w:t>Sub-resource</w:t>
             </w:r>
@@ -770,7 +979,111 @@
       <w:tr>
         <w:tc>
           <w:tcPr>
-            <w:tcW w:type="dxa" w:w="2102"/>
+            <w:tcW w:type="dxa" w:w="1752"/>
+            <w:shd w:fill="FFFFFF"/>
+          </w:tcPr>
+          <w:p>
+            <w:pPr>
+              <w:spacing w:after="20" w:before="20"/>
+            </w:pPr>
+            <w:r>
+              <w:rPr>
+                <w:sz w:val="14"/>
+              </w:rPr>
+              <w:t>7</w:t>
+            </w:r>
+          </w:p>
+        </w:tc>
+        <w:tc>
+          <w:tcPr>
+            <w:tcW w:type="dxa" w:w="1752"/>
+            <w:shd w:fill="FFFFFF"/>
+          </w:tcPr>
+          <w:p>
+            <w:pPr>
+              <w:spacing w:after="20" w:before="20"/>
+            </w:pPr>
+            <w:r>
+              <w:rPr>
+                <w:sz w:val="14"/>
+              </w:rPr>
+              <w:t>availability</w:t>
+            </w:r>
+          </w:p>
+        </w:tc>
+        <w:tc>
+          <w:tcPr>
+            <w:tcW w:type="dxa" w:w="1752"/>
+            <w:shd w:fill="FFFFFF"/>
+          </w:tcPr>
+          <w:p>
+            <w:pPr>
+              <w:spacing w:after="20" w:before="20"/>
+            </w:pPr>
+            <w:r>
+              <w:rPr>
+                <w:sz w:val="14"/>
+              </w:rPr>
+              <w:t>(Kalkulasi)</w:t>
+            </w:r>
+          </w:p>
+        </w:tc>
+        <w:tc>
+          <w:tcPr>
+            <w:tcW w:type="dxa" w:w="1752"/>
+            <w:shd w:fill="FFFFFF"/>
+          </w:tcPr>
+          <w:p>
+            <w:pPr>
+              <w:spacing w:after="20" w:before="20"/>
+            </w:pPr>
+            <w:r>
+              <w:rPr>
+                <w:sz w:val="14"/>
+              </w:rPr>
+              <w:t>court_id, play_date, slots [slot_time, status, price]</w:t>
+            </w:r>
+          </w:p>
+        </w:tc>
+        <w:tc>
+          <w:tcPr>
+            <w:tcW w:type="dxa" w:w="1752"/>
+            <w:shd w:fill="FFFFFF"/>
+          </w:tcPr>
+          <w:p>
+            <w:pPr>
+              <w:spacing w:after="20" w:before="20"/>
+            </w:pPr>
+            <w:r>
+              <w:rPr>
+                <w:sz w:val="14"/>
+              </w:rPr>
+              <w:t>Turunan dari courts (kalkulasi slot &amp; blokir)</w:t>
+            </w:r>
+          </w:p>
+        </w:tc>
+        <w:tc>
+          <w:tcPr>
+            <w:tcW w:type="dxa" w:w="1752"/>
+            <w:shd w:fill="FFFFFF"/>
+          </w:tcPr>
+          <w:p>
+            <w:pPr>
+              <w:spacing w:after="20" w:before="20"/>
+            </w:pPr>
+            <w:r>
+              <w:rPr>
+                <w:sz w:val="14"/>
+              </w:rPr>
+              <w:t>Sub-resource (Virtual / Read-Only)</w:t>
+            </w:r>
+          </w:p>
+        </w:tc>
+      </w:tr>
+      <w:tr>
+        <w:tc>
+          <w:tcPr>
+            <w:tcW w:type="dxa" w:w="1752"/>
             <w:shd w:fill="F8FAFC"/>
           </w:tcPr>
           <w:p>
@@ -779,15 +1092,15 @@
             </w:pPr>
             <w:r>
               <w:rPr>
-                <w:sz w:val="15"/>
-              </w:rPr>
-              <w:t>6</w:t>
-            </w:r>
-          </w:p>
-        </w:tc>
-        <w:tc>
-          <w:tcPr>
-            <w:tcW w:type="dxa" w:w="2102"/>
+                <w:sz w:val="14"/>
+              </w:rPr>
+              <w:t>8</w:t>
+            </w:r>
+          </w:p>
+        </w:tc>
+        <w:tc>
+          <w:tcPr>
+            <w:tcW w:type="dxa" w:w="1752"/>
             <w:shd w:fill="F8FAFC"/>
           </w:tcPr>
           <w:p>
@@ -796,7 +1109,7 @@
             </w:pPr>
             <w:r>
               <w:rPr>
-                <w:sz w:val="15"/>
+                <w:sz w:val="14"/>
               </w:rPr>
               <w:t>bookings</w:t>
             </w:r>
@@ -804,7 +1117,7 @@
         </w:tc>
         <w:tc>
           <w:tcPr>
-            <w:tcW w:type="dxa" w:w="2102"/>
+            <w:tcW w:type="dxa" w:w="1752"/>
             <w:shd w:fill="F8FAFC"/>
           </w:tcPr>
           <w:p>
@@ -813,15 +1126,15 @@
             </w:pPr>
             <w:r>
               <w:rPr>
-                <w:sz w:val="15"/>
-              </w:rPr>
-              <w:t>id, code, user_id, court_id, play_date, total_price, dp_amount, status, expires_at</w:t>
-            </w:r>
-          </w:p>
-        </w:tc>
-        <w:tc>
-          <w:tcPr>
-            <w:tcW w:type="dxa" w:w="2102"/>
+                <w:sz w:val="14"/>
+              </w:rPr>
+              <w:t>bookings</w:t>
+            </w:r>
+          </w:p>
+        </w:tc>
+        <w:tc>
+          <w:tcPr>
+            <w:tcW w:type="dxa" w:w="1752"/>
             <w:shd w:fill="F8FAFC"/>
           </w:tcPr>
           <w:p>
@@ -830,7 +1143,24 @@
             </w:pPr>
             <w:r>
               <w:rPr>
-                <w:sz w:val="15"/>
+                <w:sz w:val="14"/>
+              </w:rPr>
+              <w:t>id, code, user_id, court_id, total_price, dp_amount, status, expires_at, cancelled_at, refund_amount</w:t>
+            </w:r>
+          </w:p>
+        </w:tc>
+        <w:tc>
+          <w:tcPr>
+            <w:tcW w:type="dxa" w:w="1752"/>
+            <w:shd w:fill="F8FAFC"/>
+          </w:tcPr>
+          <w:p>
+            <w:pPr>
+              <w:spacing w:after="20" w:before="20"/>
+            </w:pPr>
+            <w:r>
+              <w:rPr>
+                <w:sz w:val="14"/>
               </w:rPr>
               <w:t>N : 1 ke users, N : 1 ke courts</w:t>
               <w:br/>
@@ -840,7 +1170,7 @@
         </w:tc>
         <w:tc>
           <w:tcPr>
-            <w:tcW w:type="dxa" w:w="2102"/>
+            <w:tcW w:type="dxa" w:w="1752"/>
             <w:shd w:fill="F8FAFC"/>
           </w:tcPr>
           <w:p>
@@ -849,7 +1179,7 @@
             </w:pPr>
             <w:r>
               <w:rPr>
-                <w:sz w:val="15"/>
+                <w:sz w:val="14"/>
               </w:rPr>
               <w:t>Collection</w:t>
             </w:r>
@@ -859,7 +1189,7 @@
       <w:tr>
         <w:tc>
           <w:tcPr>
-            <w:tcW w:type="dxa" w:w="2102"/>
+            <w:tcW w:type="dxa" w:w="1752"/>
             <w:shd w:fill="FFFFFF"/>
           </w:tcPr>
           <w:p>
@@ -868,15 +1198,15 @@
             </w:pPr>
             <w:r>
               <w:rPr>
-                <w:sz w:val="15"/>
-              </w:rPr>
-              <w:t>7</w:t>
-            </w:r>
-          </w:p>
-        </w:tc>
-        <w:tc>
-          <w:tcPr>
-            <w:tcW w:type="dxa" w:w="2102"/>
+                <w:sz w:val="14"/>
+              </w:rPr>
+              <w:t>9</w:t>
+            </w:r>
+          </w:p>
+        </w:tc>
+        <w:tc>
+          <w:tcPr>
+            <w:tcW w:type="dxa" w:w="1752"/>
             <w:shd w:fill="FFFFFF"/>
           </w:tcPr>
           <w:p>
@@ -885,7 +1215,7 @@
             </w:pPr>
             <w:r>
               <w:rPr>
-                <w:sz w:val="15"/>
+                <w:sz w:val="14"/>
               </w:rPr>
               <w:t>payments</w:t>
             </w:r>
@@ -893,7 +1223,7 @@
         </w:tc>
         <w:tc>
           <w:tcPr>
-            <w:tcW w:type="dxa" w:w="2102"/>
+            <w:tcW w:type="dxa" w:w="1752"/>
             <w:shd w:fill="FFFFFF"/>
           </w:tcPr>
           <w:p>
@@ -902,15 +1232,15 @@
             </w:pPr>
             <w:r>
               <w:rPr>
-                <w:sz w:val="15"/>
-              </w:rPr>
-              <w:t>id, booking_id, order_id, type, amount, status, snap_token, redirect_url</w:t>
-            </w:r>
-          </w:p>
-        </w:tc>
-        <w:tc>
-          <w:tcPr>
-            <w:tcW w:type="dxa" w:w="2102"/>
+                <w:sz w:val="14"/>
+              </w:rPr>
+              <w:t>payments</w:t>
+            </w:r>
+          </w:p>
+        </w:tc>
+        <w:tc>
+          <w:tcPr>
+            <w:tcW w:type="dxa" w:w="1752"/>
             <w:shd w:fill="FFFFFF"/>
           </w:tcPr>
           <w:p>
@@ -919,7 +1249,24 @@
             </w:pPr>
             <w:r>
               <w:rPr>
-                <w:sz w:val="15"/>
+                <w:sz w:val="14"/>
+              </w:rPr>
+              <w:t>id, booking_id, order_id, type, amount, status, payment_type, snap_token, snap_redirect_url, paid_at</w:t>
+            </w:r>
+          </w:p>
+        </w:tc>
+        <w:tc>
+          <w:tcPr>
+            <w:tcW w:type="dxa" w:w="1752"/>
+            <w:shd w:fill="FFFFFF"/>
+          </w:tcPr>
+          <w:p>
+            <w:pPr>
+              <w:spacing w:after="20" w:before="20"/>
+            </w:pPr>
+            <w:r>
+              <w:rPr>
+                <w:sz w:val="14"/>
               </w:rPr>
               <w:t>N : 1 ke bookings</w:t>
             </w:r>
@@ -927,7 +1274,7 @@
         </w:tc>
         <w:tc>
           <w:tcPr>
-            <w:tcW w:type="dxa" w:w="2102"/>
+            <w:tcW w:type="dxa" w:w="1752"/>
             <w:shd w:fill="FFFFFF"/>
           </w:tcPr>
           <w:p>
@@ -936,7 +1283,7 @@
             </w:pPr>
             <w:r>
               <w:rPr>
-                <w:sz w:val="15"/>
+                <w:sz w:val="14"/>
               </w:rPr>
               <w:t>Sub-resource / Collection</w:t>
             </w:r>
@@ -946,7 +1293,7 @@
       <w:tr>
         <w:tc>
           <w:tcPr>
-            <w:tcW w:type="dxa" w:w="2102"/>
+            <w:tcW w:type="dxa" w:w="1752"/>
             <w:shd w:fill="F8FAFC"/>
           </w:tcPr>
           <w:p>
@@ -955,15 +1302,15 @@
             </w:pPr>
             <w:r>
               <w:rPr>
-                <w:sz w:val="15"/>
-              </w:rPr>
-              <w:t>8</w:t>
-            </w:r>
-          </w:p>
-        </w:tc>
-        <w:tc>
-          <w:tcPr>
-            <w:tcW w:type="dxa" w:w="2102"/>
+                <w:sz w:val="14"/>
+              </w:rPr>
+              <w:t>10</w:t>
+            </w:r>
+          </w:p>
+        </w:tc>
+        <w:tc>
+          <w:tcPr>
+            <w:tcW w:type="dxa" w:w="1752"/>
             <w:shd w:fill="F8FAFC"/>
           </w:tcPr>
           <w:p>
@@ -972,15 +1319,15 @@
             </w:pPr>
             <w:r>
               <w:rPr>
-                <w:sz w:val="15"/>
-              </w:rPr>
-              <w:t>me</w:t>
-            </w:r>
-          </w:p>
-        </w:tc>
-        <w:tc>
-          <w:tcPr>
-            <w:tcW w:type="dxa" w:w="2102"/>
+                <w:sz w:val="14"/>
+              </w:rPr>
+              <w:t>booking_slots</w:t>
+            </w:r>
+          </w:p>
+        </w:tc>
+        <w:tc>
+          <w:tcPr>
+            <w:tcW w:type="dxa" w:w="1752"/>
             <w:shd w:fill="F8FAFC"/>
           </w:tcPr>
           <w:p>
@@ -989,15 +1336,15 @@
             </w:pPr>
             <w:r>
               <w:rPr>
-                <w:sz w:val="15"/>
-              </w:rPr>
-              <w:t>id, name, email, phone, role, status, created_at</w:t>
-            </w:r>
-          </w:p>
-        </w:tc>
-        <w:tc>
-          <w:tcPr>
-            <w:tcW w:type="dxa" w:w="2102"/>
+                <w:sz w:val="14"/>
+              </w:rPr>
+              <w:t>booking_slots</w:t>
+            </w:r>
+          </w:p>
+        </w:tc>
+        <w:tc>
+          <w:tcPr>
+            <w:tcW w:type="dxa" w:w="1752"/>
             <w:shd w:fill="F8FAFC"/>
           </w:tcPr>
           <w:p>
@@ -1006,15 +1353,15 @@
             </w:pPr>
             <w:r>
               <w:rPr>
-                <w:sz w:val="15"/>
-              </w:rPr>
-              <w:t>N/A (merujuk ke pengguna login)</w:t>
-            </w:r>
-          </w:p>
-        </w:tc>
-        <w:tc>
-          <w:tcPr>
-            <w:tcW w:type="dxa" w:w="2102"/>
+                <w:sz w:val="14"/>
+              </w:rPr>
+              <w:t>id, booking_id, court_id, slot_start, slot_end, price</w:t>
+            </w:r>
+          </w:p>
+        </w:tc>
+        <w:tc>
+          <w:tcPr>
+            <w:tcW w:type="dxa" w:w="1752"/>
             <w:shd w:fill="F8FAFC"/>
           </w:tcPr>
           <w:p>
@@ -1023,77 +1370,7 @@
             </w:pPr>
             <w:r>
               <w:rPr>
-                <w:sz w:val="15"/>
-              </w:rPr>
-              <w:t>Singleton</w:t>
-            </w:r>
-          </w:p>
-        </w:tc>
-      </w:tr>
-      <w:tr>
-        <w:tc>
-          <w:tcPr>
-            <w:tcW w:type="dxa" w:w="2102"/>
-            <w:shd w:fill="FFFFFF"/>
-          </w:tcPr>
-          <w:p>
-            <w:pPr>
-              <w:spacing w:after="20" w:before="20"/>
-            </w:pPr>
-            <w:r>
-              <w:rPr>
-                <w:sz w:val="15"/>
-              </w:rPr>
-              <w:t>9</w:t>
-            </w:r>
-          </w:p>
-        </w:tc>
-        <w:tc>
-          <w:tcPr>
-            <w:tcW w:type="dxa" w:w="2102"/>
-            <w:shd w:fill="FFFFFF"/>
-          </w:tcPr>
-          <w:p>
-            <w:pPr>
-              <w:spacing w:after="20" w:before="20"/>
-            </w:pPr>
-            <w:r>
-              <w:rPr>
-                <w:sz w:val="15"/>
-              </w:rPr>
-              <w:t>booking_slots</w:t>
-            </w:r>
-          </w:p>
-        </w:tc>
-        <w:tc>
-          <w:tcPr>
-            <w:tcW w:type="dxa" w:w="2102"/>
-            <w:shd w:fill="FFFFFF"/>
-          </w:tcPr>
-          <w:p>
-            <w:pPr>
-              <w:spacing w:after="20" w:before="20"/>
-            </w:pPr>
-            <w:r>
-              <w:rPr>
-                <w:sz w:val="15"/>
-              </w:rPr>
-              <w:t>id, booking_id, court_id, slot_start, slot_end</w:t>
-            </w:r>
-          </w:p>
-        </w:tc>
-        <w:tc>
-          <w:tcPr>
-            <w:tcW w:type="dxa" w:w="2102"/>
-            <w:shd w:fill="FFFFFF"/>
-          </w:tcPr>
-          <w:p>
-            <w:pPr>
-              <w:spacing w:after="20" w:before="20"/>
-            </w:pPr>
-            <w:r>
-              <w:rPr>
-                <w:sz w:val="15"/>
+                <w:sz w:val="14"/>
               </w:rPr>
               <w:t>N : 1 ke bookings</w:t>
               <w:br/>
@@ -1103,7 +1380,26 @@
         </w:tc>
         <w:tc>
           <w:tcPr>
-            <w:tcW w:type="dxa" w:w="2102"/>
+            <w:tcW w:type="dxa" w:w="1752"/>
+            <w:shd w:fill="F8FAFC"/>
+          </w:tcPr>
+          <w:p>
+            <w:pPr>
+              <w:spacing w:after="20" w:before="20"/>
+            </w:pPr>
+            <w:r>
+              <w:rPr>
+                <w:sz w:val="14"/>
+              </w:rPr>
+              <w:t>Internal Engine (Anti Double Booking)</w:t>
+            </w:r>
+          </w:p>
+        </w:tc>
+      </w:tr>
+      <w:tr>
+        <w:tc>
+          <w:tcPr>
+            <w:tcW w:type="dxa" w:w="1752"/>
             <w:shd w:fill="FFFFFF"/>
           </w:tcPr>
           <w:p>
@@ -1112,9 +1408,94 @@
             </w:pPr>
             <w:r>
               <w:rPr>
-                <w:sz w:val="15"/>
-              </w:rPr>
-              <w:t>Internal Engine (Anti-Collision)</w:t>
+                <w:sz w:val="14"/>
+              </w:rPr>
+              <w:t>11</w:t>
+            </w:r>
+          </w:p>
+        </w:tc>
+        <w:tc>
+          <w:tcPr>
+            <w:tcW w:type="dxa" w:w="1752"/>
+            <w:shd w:fill="FFFFFF"/>
+          </w:tcPr>
+          <w:p>
+            <w:pPr>
+              <w:spacing w:after="20" w:before="20"/>
+            </w:pPr>
+            <w:r>
+              <w:rPr>
+                <w:sz w:val="14"/>
+              </w:rPr>
+              <w:t>me</w:t>
+            </w:r>
+          </w:p>
+        </w:tc>
+        <w:tc>
+          <w:tcPr>
+            <w:tcW w:type="dxa" w:w="1752"/>
+            <w:shd w:fill="FFFFFF"/>
+          </w:tcPr>
+          <w:p>
+            <w:pPr>
+              <w:spacing w:after="20" w:before="20"/>
+            </w:pPr>
+            <w:r>
+              <w:rPr>
+                <w:sz w:val="14"/>
+              </w:rPr>
+              <w:t>users</w:t>
+            </w:r>
+          </w:p>
+        </w:tc>
+        <w:tc>
+          <w:tcPr>
+            <w:tcW w:type="dxa" w:w="1752"/>
+            <w:shd w:fill="FFFFFF"/>
+          </w:tcPr>
+          <w:p>
+            <w:pPr>
+              <w:spacing w:after="20" w:before="20"/>
+            </w:pPr>
+            <w:r>
+              <w:rPr>
+                <w:sz w:val="14"/>
+              </w:rPr>
+              <w:t>id, name, email, phone, role, status</w:t>
+            </w:r>
+          </w:p>
+        </w:tc>
+        <w:tc>
+          <w:tcPr>
+            <w:tcW w:type="dxa" w:w="1752"/>
+            <w:shd w:fill="FFFFFF"/>
+          </w:tcPr>
+          <w:p>
+            <w:pPr>
+              <w:spacing w:after="20" w:before="20"/>
+            </w:pPr>
+            <w:r>
+              <w:rPr>
+                <w:sz w:val="14"/>
+              </w:rPr>
+              <w:t>N/A (merujuk ke pengguna login)</w:t>
+            </w:r>
+          </w:p>
+        </w:tc>
+        <w:tc>
+          <w:tcPr>
+            <w:tcW w:type="dxa" w:w="1752"/>
+            <w:shd w:fill="FFFFFF"/>
+          </w:tcPr>
+          <w:p>
+            <w:pPr>
+              <w:spacing w:after="20" w:before="20"/>
+            </w:pPr>
+            <w:r>
+              <w:rPr>
+                <w:sz w:val="14"/>
+              </w:rPr>
+              <w:t>Singleton</w:t>
             </w:r>
           </w:p>
         </w:tc>
@@ -1164,7 +1545,7 @@
               <w:rPr>
                 <w:b/>
                 <w:color w:val="FFFFFF"/>
-                <w:sz w:val="14"/>
+                <w:sz w:val="13"/>
               </w:rPr>
               <w:t>No</w:t>
             </w:r>
@@ -1183,7 +1564,7 @@
               <w:rPr>
                 <w:b/>
                 <w:color w:val="FFFFFF"/>
-                <w:sz w:val="14"/>
+                <w:sz w:val="13"/>
               </w:rPr>
               <w:t>Method</w:t>
             </w:r>
@@ -1202,7 +1583,7 @@
               <w:rPr>
                 <w:b/>
                 <w:color w:val="FFFFFF"/>
-                <w:sz w:val="14"/>
+                <w:sz w:val="13"/>
               </w:rPr>
               <w:t>Endpoint (/api/v1)</w:t>
             </w:r>
@@ -1221,7 +1602,7 @@
               <w:rPr>
                 <w:b/>
                 <w:color w:val="FFFFFF"/>
-                <w:sz w:val="14"/>
+                <w:sz w:val="13"/>
               </w:rPr>
               <w:t>Fungsi &amp; Deskripsi Operasi</w:t>
             </w:r>
@@ -1240,7 +1621,7 @@
               <w:rPr>
                 <w:b/>
                 <w:color w:val="FFFFFF"/>
-                <w:sz w:val="14"/>
+                <w:sz w:val="13"/>
               </w:rPr>
               <w:t>Aktor</w:t>
             </w:r>
@@ -1259,7 +1640,7 @@
               <w:rPr>
                 <w:b/>
                 <w:color w:val="FFFFFF"/>
-                <w:sz w:val="14"/>
+                <w:sz w:val="13"/>
               </w:rPr>
               <w:t>Sukses</w:t>
             </w:r>
@@ -1278,7 +1659,7 @@
               <w:rPr>
                 <w:b/>
                 <w:color w:val="FFFFFF"/>
-                <w:sz w:val="14"/>
+                <w:sz w:val="13"/>
               </w:rPr>
               <w:t>Status Gagal Relevan</w:t>
             </w:r>
@@ -1297,7 +1678,7 @@
             </w:pPr>
             <w:r>
               <w:rPr>
-                <w:sz w:val="14"/>
+                <w:sz w:val="13"/>
               </w:rPr>
               <w:t>1</w:t>
             </w:r>
@@ -1314,7 +1695,7 @@
             </w:pPr>
             <w:r>
               <w:rPr>
-                <w:sz w:val="14"/>
+                <w:sz w:val="13"/>
               </w:rPr>
               <w:t>POST</w:t>
             </w:r>
@@ -1331,7 +1712,7 @@
             </w:pPr>
             <w:r>
               <w:rPr>
-                <w:sz w:val="14"/>
+                <w:sz w:val="13"/>
               </w:rPr>
               <w:t>/auth/register</w:t>
             </w:r>
@@ -1348,7 +1729,7 @@
             </w:pPr>
             <w:r>
               <w:rPr>
-                <w:sz w:val="14"/>
+                <w:sz w:val="13"/>
               </w:rPr>
               <w:t>Registrasi pengguna baru (penyewa aktif, pengelola pending)</w:t>
             </w:r>
@@ -1365,7 +1746,7 @@
             </w:pPr>
             <w:r>
               <w:rPr>
-                <w:sz w:val="14"/>
+                <w:sz w:val="13"/>
               </w:rPr>
               <w:t>Publik</w:t>
             </w:r>
@@ -1382,7 +1763,7 @@
             </w:pPr>
             <w:r>
               <w:rPr>
-                <w:sz w:val="14"/>
+                <w:sz w:val="13"/>
               </w:rPr>
               <w:t>201 Created</w:t>
             </w:r>
@@ -1399,7 +1780,7 @@
             </w:pPr>
             <w:r>
               <w:rPr>
-                <w:sz w:val="14"/>
+                <w:sz w:val="13"/>
               </w:rPr>
               <w:t>400, 422</w:t>
             </w:r>
@@ -1418,7 +1799,7 @@
             </w:pPr>
             <w:r>
               <w:rPr>
-                <w:sz w:val="14"/>
+                <w:sz w:val="13"/>
               </w:rPr>
               <w:t>2</w:t>
             </w:r>
@@ -1435,7 +1816,7 @@
             </w:pPr>
             <w:r>
               <w:rPr>
-                <w:sz w:val="14"/>
+                <w:sz w:val="13"/>
               </w:rPr>
               <w:t>POST</w:t>
             </w:r>
@@ -1452,7 +1833,7 @@
             </w:pPr>
             <w:r>
               <w:rPr>
-                <w:sz w:val="14"/>
+                <w:sz w:val="13"/>
               </w:rPr>
               <w:t>/auth/login</w:t>
             </w:r>
@@ -1469,7 +1850,7 @@
             </w:pPr>
             <w:r>
               <w:rPr>
-                <w:sz w:val="14"/>
+                <w:sz w:val="13"/>
               </w:rPr>
               <w:t>Autentikasi akun &amp; penerbitan token Sanctum</w:t>
             </w:r>
@@ -1486,7 +1867,7 @@
             </w:pPr>
             <w:r>
               <w:rPr>
-                <w:sz w:val="14"/>
+                <w:sz w:val="13"/>
               </w:rPr>
               <w:t>Publik</w:t>
             </w:r>
@@ -1503,7 +1884,7 @@
             </w:pPr>
             <w:r>
               <w:rPr>
-                <w:sz w:val="14"/>
+                <w:sz w:val="13"/>
               </w:rPr>
               <w:t>200 OK</w:t>
             </w:r>
@@ -1520,7 +1901,7 @@
             </w:pPr>
             <w:r>
               <w:rPr>
-                <w:sz w:val="14"/>
+                <w:sz w:val="13"/>
               </w:rPr>
               <w:t>401, 422</w:t>
             </w:r>
@@ -1539,7 +1920,7 @@
             </w:pPr>
             <w:r>
               <w:rPr>
-                <w:sz w:val="14"/>
+                <w:sz w:val="13"/>
               </w:rPr>
               <w:t>3</w:t>
             </w:r>
@@ -1556,7 +1937,7 @@
             </w:pPr>
             <w:r>
               <w:rPr>
-                <w:sz w:val="14"/>
+                <w:sz w:val="13"/>
               </w:rPr>
               <w:t>POST</w:t>
             </w:r>
@@ -1573,7 +1954,7 @@
             </w:pPr>
             <w:r>
               <w:rPr>
-                <w:sz w:val="14"/>
+                <w:sz w:val="13"/>
               </w:rPr>
               <w:t>/auth/logout</w:t>
             </w:r>
@@ -1590,7 +1971,7 @@
             </w:pPr>
             <w:r>
               <w:rPr>
-                <w:sz w:val="14"/>
+                <w:sz w:val="13"/>
               </w:rPr>
               <w:t>Revokasi token autentikasi aktif pengguna</w:t>
             </w:r>
@@ -1607,7 +1988,7 @@
             </w:pPr>
             <w:r>
               <w:rPr>
-                <w:sz w:val="14"/>
+                <w:sz w:val="13"/>
               </w:rPr>
               <w:t>Login</w:t>
             </w:r>
@@ -1624,7 +2005,7 @@
             </w:pPr>
             <w:r>
               <w:rPr>
-                <w:sz w:val="14"/>
+                <w:sz w:val="13"/>
               </w:rPr>
               <w:t>204 No Content</w:t>
             </w:r>
@@ -1641,7 +2022,7 @@
             </w:pPr>
             <w:r>
               <w:rPr>
-                <w:sz w:val="14"/>
+                <w:sz w:val="13"/>
               </w:rPr>
               <w:t>401</w:t>
             </w:r>
@@ -1660,7 +2041,7 @@
             </w:pPr>
             <w:r>
               <w:rPr>
-                <w:sz w:val="14"/>
+                <w:sz w:val="13"/>
               </w:rPr>
               <w:t>4</w:t>
             </w:r>
@@ -1677,7 +2058,7 @@
             </w:pPr>
             <w:r>
               <w:rPr>
-                <w:sz w:val="14"/>
+                <w:sz w:val="13"/>
               </w:rPr>
               <w:t>GET</w:t>
             </w:r>
@@ -1694,7 +2075,7 @@
             </w:pPr>
             <w:r>
               <w:rPr>
-                <w:sz w:val="14"/>
+                <w:sz w:val="13"/>
               </w:rPr>
               <w:t>/me</w:t>
             </w:r>
@@ -1711,7 +2092,7 @@
             </w:pPr>
             <w:r>
               <w:rPr>
-                <w:sz w:val="14"/>
+                <w:sz w:val="13"/>
               </w:rPr>
               <w:t>Mengambil profil pengguna yang login (singleton)</w:t>
             </w:r>
@@ -1728,7 +2109,7 @@
             </w:pPr>
             <w:r>
               <w:rPr>
-                <w:sz w:val="14"/>
+                <w:sz w:val="13"/>
               </w:rPr>
               <w:t>Login</w:t>
             </w:r>
@@ -1745,7 +2126,7 @@
             </w:pPr>
             <w:r>
               <w:rPr>
-                <w:sz w:val="14"/>
+                <w:sz w:val="13"/>
               </w:rPr>
               <w:t>200 OK</w:t>
             </w:r>
@@ -1762,7 +2143,7 @@
             </w:pPr>
             <w:r>
               <w:rPr>
-                <w:sz w:val="14"/>
+                <w:sz w:val="13"/>
               </w:rPr>
               <w:t>401</w:t>
             </w:r>
@@ -1781,7 +2162,7 @@
             </w:pPr>
             <w:r>
               <w:rPr>
-                <w:sz w:val="14"/>
+                <w:sz w:val="13"/>
               </w:rPr>
               <w:t>5</w:t>
             </w:r>
@@ -1798,7 +2179,7 @@
             </w:pPr>
             <w:r>
               <w:rPr>
-                <w:sz w:val="14"/>
+                <w:sz w:val="13"/>
               </w:rPr>
               <w:t>GET</w:t>
             </w:r>
@@ -1815,7 +2196,7 @@
             </w:pPr>
             <w:r>
               <w:rPr>
-                <w:sz w:val="14"/>
+                <w:sz w:val="13"/>
               </w:rPr>
               <w:t>/venues</w:t>
             </w:r>
@@ -1832,7 +2213,7 @@
             </w:pPr>
             <w:r>
               <w:rPr>
-                <w:sz w:val="14"/>
+                <w:sz w:val="13"/>
               </w:rPr>
               <w:t>Katalog venue mitra dengan filter city, sport_type, q</w:t>
             </w:r>
@@ -1849,7 +2230,7 @@
             </w:pPr>
             <w:r>
               <w:rPr>
-                <w:sz w:val="14"/>
+                <w:sz w:val="13"/>
               </w:rPr>
               <w:t>Publik</w:t>
             </w:r>
@@ -1866,7 +2247,7 @@
             </w:pPr>
             <w:r>
               <w:rPr>
-                <w:sz w:val="14"/>
+                <w:sz w:val="13"/>
               </w:rPr>
               <w:t>200 OK</w:t>
             </w:r>
@@ -1883,7 +2264,7 @@
             </w:pPr>
             <w:r>
               <w:rPr>
-                <w:sz w:val="14"/>
+                <w:sz w:val="13"/>
               </w:rPr>
               <w:t>400, 422</w:t>
             </w:r>
@@ -1902,7 +2283,7 @@
             </w:pPr>
             <w:r>
               <w:rPr>
-                <w:sz w:val="14"/>
+                <w:sz w:val="13"/>
               </w:rPr>
               <w:t>6</w:t>
             </w:r>
@@ -1919,7 +2300,7 @@
             </w:pPr>
             <w:r>
               <w:rPr>
-                <w:sz w:val="14"/>
+                <w:sz w:val="13"/>
               </w:rPr>
               <w:t>GET</w:t>
             </w:r>
@@ -1936,7 +2317,7 @@
             </w:pPr>
             <w:r>
               <w:rPr>
-                <w:sz w:val="14"/>
+                <w:sz w:val="13"/>
               </w:rPr>
               <w:t>/venues/{id}</w:t>
             </w:r>
@@ -1953,7 +2334,7 @@
             </w:pPr>
             <w:r>
               <w:rPr>
-                <w:sz w:val="14"/>
+                <w:sz w:val="13"/>
               </w:rPr>
               <w:t>Detail satu venue beserta fasilitas lapangannya</w:t>
             </w:r>
@@ -1970,7 +2351,7 @@
             </w:pPr>
             <w:r>
               <w:rPr>
-                <w:sz w:val="14"/>
+                <w:sz w:val="13"/>
               </w:rPr>
               <w:t>Publik</w:t>
             </w:r>
@@ -1987,7 +2368,7 @@
             </w:pPr>
             <w:r>
               <w:rPr>
-                <w:sz w:val="14"/>
+                <w:sz w:val="13"/>
               </w:rPr>
               <w:t>200 OK</w:t>
             </w:r>
@@ -2004,7 +2385,7 @@
             </w:pPr>
             <w:r>
               <w:rPr>
-                <w:sz w:val="14"/>
+                <w:sz w:val="13"/>
               </w:rPr>
               <w:t>404</w:t>
             </w:r>
@@ -2023,7 +2404,7 @@
             </w:pPr>
             <w:r>
               <w:rPr>
-                <w:sz w:val="14"/>
+                <w:sz w:val="13"/>
               </w:rPr>
               <w:t>7</w:t>
             </w:r>
@@ -2040,7 +2421,7 @@
             </w:pPr>
             <w:r>
               <w:rPr>
-                <w:sz w:val="14"/>
+                <w:sz w:val="13"/>
               </w:rPr>
               <w:t>GET</w:t>
             </w:r>
@@ -2057,7 +2438,7 @@
             </w:pPr>
             <w:r>
               <w:rPr>
-                <w:sz w:val="14"/>
+                <w:sz w:val="13"/>
               </w:rPr>
               <w:t>/venues/{id}/courts</w:t>
             </w:r>
@@ -2074,7 +2455,7 @@
             </w:pPr>
             <w:r>
               <w:rPr>
-                <w:sz w:val="14"/>
+                <w:sz w:val="13"/>
               </w:rPr>
               <w:t>Daftar lapangan pada venue tertentu</w:t>
             </w:r>
@@ -2091,7 +2472,7 @@
             </w:pPr>
             <w:r>
               <w:rPr>
-                <w:sz w:val="14"/>
+                <w:sz w:val="13"/>
               </w:rPr>
               <w:t>Publik</w:t>
             </w:r>
@@ -2108,7 +2489,7 @@
             </w:pPr>
             <w:r>
               <w:rPr>
-                <w:sz w:val="14"/>
+                <w:sz w:val="13"/>
               </w:rPr>
               <w:t>200 OK</w:t>
             </w:r>
@@ -2125,7 +2506,7 @@
             </w:pPr>
             <w:r>
               <w:rPr>
-                <w:sz w:val="14"/>
+                <w:sz w:val="13"/>
               </w:rPr>
               <w:t>404</w:t>
             </w:r>
@@ -2144,7 +2525,7 @@
             </w:pPr>
             <w:r>
               <w:rPr>
-                <w:sz w:val="14"/>
+                <w:sz w:val="13"/>
               </w:rPr>
               <w:t>8</w:t>
             </w:r>
@@ -2161,7 +2542,7 @@
             </w:pPr>
             <w:r>
               <w:rPr>
-                <w:sz w:val="14"/>
+                <w:sz w:val="13"/>
               </w:rPr>
               <w:t>GET</w:t>
             </w:r>
@@ -2178,7 +2559,7 @@
             </w:pPr>
             <w:r>
               <w:rPr>
-                <w:sz w:val="14"/>
+                <w:sz w:val="13"/>
               </w:rPr>
               <w:t>/courts/{id}</w:t>
             </w:r>
@@ -2195,7 +2576,7 @@
             </w:pPr>
             <w:r>
               <w:rPr>
-                <w:sz w:val="14"/>
+                <w:sz w:val="13"/>
               </w:rPr>
               <w:t>Detail spesifikasi teknis lapangan fisik</w:t>
             </w:r>
@@ -2212,7 +2593,7 @@
             </w:pPr>
             <w:r>
               <w:rPr>
-                <w:sz w:val="14"/>
+                <w:sz w:val="13"/>
               </w:rPr>
               <w:t>Publik</w:t>
             </w:r>
@@ -2229,7 +2610,7 @@
             </w:pPr>
             <w:r>
               <w:rPr>
-                <w:sz w:val="14"/>
+                <w:sz w:val="13"/>
               </w:rPr>
               <w:t>200 OK</w:t>
             </w:r>
@@ -2246,7 +2627,7 @@
             </w:pPr>
             <w:r>
               <w:rPr>
-                <w:sz w:val="14"/>
+                <w:sz w:val="13"/>
               </w:rPr>
               <w:t>404</w:t>
             </w:r>
@@ -2265,7 +2646,7 @@
             </w:pPr>
             <w:r>
               <w:rPr>
-                <w:sz w:val="14"/>
+                <w:sz w:val="13"/>
               </w:rPr>
               <w:t>9</w:t>
             </w:r>
@@ -2282,7 +2663,7 @@
             </w:pPr>
             <w:r>
               <w:rPr>
-                <w:sz w:val="14"/>
+                <w:sz w:val="13"/>
               </w:rPr>
               <w:t>GET</w:t>
             </w:r>
@@ -2299,7 +2680,7 @@
             </w:pPr>
             <w:r>
               <w:rPr>
-                <w:sz w:val="14"/>
+                <w:sz w:val="13"/>
               </w:rPr>
               <w:t>/courts/{id}/prices</w:t>
             </w:r>
@@ -2316,7 +2697,7 @@
             </w:pPr>
             <w:r>
               <w:rPr>
-                <w:sz w:val="14"/>
+                <w:sz w:val="13"/>
               </w:rPr>
               <w:t>Daftar struktur harga lapangan (reguler, peak, weekend)</w:t>
             </w:r>
@@ -2333,7 +2714,7 @@
             </w:pPr>
             <w:r>
               <w:rPr>
-                <w:sz w:val="14"/>
+                <w:sz w:val="13"/>
               </w:rPr>
               <w:t>Publik</w:t>
             </w:r>
@@ -2350,7 +2731,7 @@
             </w:pPr>
             <w:r>
               <w:rPr>
-                <w:sz w:val="14"/>
+                <w:sz w:val="13"/>
               </w:rPr>
               <w:t>200 OK</w:t>
             </w:r>
@@ -2367,7 +2748,7 @@
             </w:pPr>
             <w:r>
               <w:rPr>
-                <w:sz w:val="14"/>
+                <w:sz w:val="13"/>
               </w:rPr>
               <w:t>404</w:t>
             </w:r>
@@ -2386,7 +2767,7 @@
             </w:pPr>
             <w:r>
               <w:rPr>
-                <w:sz w:val="14"/>
+                <w:sz w:val="13"/>
               </w:rPr>
               <w:t>10</w:t>
             </w:r>
@@ -2403,7 +2784,7 @@
             </w:pPr>
             <w:r>
               <w:rPr>
-                <w:sz w:val="14"/>
+                <w:sz w:val="13"/>
               </w:rPr>
               <w:t>GET</w:t>
             </w:r>
@@ -2420,9 +2801,9 @@
             </w:pPr>
             <w:r>
               <w:rPr>
-                <w:sz w:val="14"/>
-              </w:rPr>
-              <w:t>/courts/{id}/availability</w:t>
+                <w:sz w:val="13"/>
+              </w:rPr>
+              <w:t>/courts/{id}/operating-hours</w:t>
             </w:r>
           </w:p>
         </w:tc>
@@ -2437,9 +2818,9 @@
             </w:pPr>
             <w:r>
               <w:rPr>
-                <w:sz w:val="14"/>
-              </w:rPr>
-              <w:t>Matriks ketersediaan slot jam &amp; tarif per tanggal</w:t>
+                <w:sz w:val="13"/>
+              </w:rPr>
+              <w:t>Daftar jam operasional lapangan seminggu penuh</w:t>
             </w:r>
           </w:p>
         </w:tc>
@@ -2454,7 +2835,7 @@
             </w:pPr>
             <w:r>
               <w:rPr>
-                <w:sz w:val="14"/>
+                <w:sz w:val="13"/>
               </w:rPr>
               <w:t>Publik</w:t>
             </w:r>
@@ -2471,7 +2852,7 @@
             </w:pPr>
             <w:r>
               <w:rPr>
-                <w:sz w:val="14"/>
+                <w:sz w:val="13"/>
               </w:rPr>
               <w:t>200 OK</w:t>
             </w:r>
@@ -2488,9 +2869,9 @@
             </w:pPr>
             <w:r>
               <w:rPr>
-                <w:sz w:val="14"/>
-              </w:rPr>
-              <w:t>404, 422</w:t>
+                <w:sz w:val="13"/>
+              </w:rPr>
+              <w:t>404</w:t>
             </w:r>
           </w:p>
         </w:tc>
@@ -2507,7 +2888,7 @@
             </w:pPr>
             <w:r>
               <w:rPr>
-                <w:sz w:val="14"/>
+                <w:sz w:val="13"/>
               </w:rPr>
               <w:t>11</w:t>
             </w:r>
@@ -2524,9 +2905,9 @@
             </w:pPr>
             <w:r>
               <w:rPr>
-                <w:sz w:val="14"/>
-              </w:rPr>
-              <w:t>POST</w:t>
+                <w:sz w:val="13"/>
+              </w:rPr>
+              <w:t>GET</w:t>
             </w:r>
           </w:p>
         </w:tc>
@@ -2541,9 +2922,9 @@
             </w:pPr>
             <w:r>
               <w:rPr>
-                <w:sz w:val="14"/>
-              </w:rPr>
-              <w:t>/bookings</w:t>
+                <w:sz w:val="13"/>
+              </w:rPr>
+              <w:t>/courts/{id}/availability</w:t>
             </w:r>
           </w:p>
         </w:tc>
@@ -2558,9 +2939,9 @@
             </w:pPr>
             <w:r>
               <w:rPr>
-                <w:sz w:val="14"/>
-              </w:rPr>
-              <w:t>Reservasi booking baru, kunci slot atomik, hold 15 menit</w:t>
+                <w:sz w:val="13"/>
+              </w:rPr>
+              <w:t>Matriks ketersediaan slot jam &amp; tarif per tanggal</w:t>
             </w:r>
           </w:p>
         </w:tc>
@@ -2575,9 +2956,9 @@
             </w:pPr>
             <w:r>
               <w:rPr>
-                <w:sz w:val="14"/>
-              </w:rPr>
-              <w:t>Penyewa</w:t>
+                <w:sz w:val="13"/>
+              </w:rPr>
+              <w:t>Publik</w:t>
             </w:r>
           </w:p>
         </w:tc>
@@ -2592,9 +2973,9 @@
             </w:pPr>
             <w:r>
               <w:rPr>
-                <w:sz w:val="14"/>
-              </w:rPr>
-              <w:t>201 Created</w:t>
+                <w:sz w:val="13"/>
+              </w:rPr>
+              <w:t>200 OK</w:t>
             </w:r>
           </w:p>
         </w:tc>
@@ -2609,9 +2990,9 @@
             </w:pPr>
             <w:r>
               <w:rPr>
-                <w:sz w:val="14"/>
-              </w:rPr>
-              <w:t>400, 409, 422</w:t>
+                <w:sz w:val="13"/>
+              </w:rPr>
+              <w:t>404, 422</w:t>
             </w:r>
           </w:p>
         </w:tc>
@@ -2628,7 +3009,7 @@
             </w:pPr>
             <w:r>
               <w:rPr>
-                <w:sz w:val="14"/>
+                <w:sz w:val="13"/>
               </w:rPr>
               <w:t>12</w:t>
             </w:r>
@@ -2645,9 +3026,9 @@
             </w:pPr>
             <w:r>
               <w:rPr>
-                <w:sz w:val="14"/>
-              </w:rPr>
-              <w:t>GET</w:t>
+                <w:sz w:val="13"/>
+              </w:rPr>
+              <w:t>POST</w:t>
             </w:r>
           </w:p>
         </w:tc>
@@ -2662,7 +3043,7 @@
             </w:pPr>
             <w:r>
               <w:rPr>
-                <w:sz w:val="14"/>
+                <w:sz w:val="13"/>
               </w:rPr>
               <w:t>/bookings</w:t>
             </w:r>
@@ -2679,9 +3060,9 @@
             </w:pPr>
             <w:r>
               <w:rPr>
-                <w:sz w:val="14"/>
-              </w:rPr>
-              <w:t>Riwayat transaksi booking milik penyewa aktif</w:t>
+                <w:sz w:val="13"/>
+              </w:rPr>
+              <w:t>Reservasi booking baru, kunci slot atomik, hold 15 menit</w:t>
             </w:r>
           </w:p>
         </w:tc>
@@ -2696,7 +3077,7 @@
             </w:pPr>
             <w:r>
               <w:rPr>
-                <w:sz w:val="14"/>
+                <w:sz w:val="13"/>
               </w:rPr>
               <w:t>Penyewa</w:t>
             </w:r>
@@ -2713,9 +3094,9 @@
             </w:pPr>
             <w:r>
               <w:rPr>
-                <w:sz w:val="14"/>
-              </w:rPr>
-              <w:t>200 OK</w:t>
+                <w:sz w:val="13"/>
+              </w:rPr>
+              <w:t>201 Created</w:t>
             </w:r>
           </w:p>
         </w:tc>
@@ -2730,9 +3111,9 @@
             </w:pPr>
             <w:r>
               <w:rPr>
-                <w:sz w:val="14"/>
-              </w:rPr>
-              <w:t>401</w:t>
+                <w:sz w:val="13"/>
+              </w:rPr>
+              <w:t>400, 409, 422</w:t>
             </w:r>
           </w:p>
         </w:tc>
@@ -2749,7 +3130,7 @@
             </w:pPr>
             <w:r>
               <w:rPr>
-                <w:sz w:val="14"/>
+                <w:sz w:val="13"/>
               </w:rPr>
               <w:t>13</w:t>
             </w:r>
@@ -2766,7 +3147,7 @@
             </w:pPr>
             <w:r>
               <w:rPr>
-                <w:sz w:val="14"/>
+                <w:sz w:val="13"/>
               </w:rPr>
               <w:t>GET</w:t>
             </w:r>
@@ -2783,9 +3164,9 @@
             </w:pPr>
             <w:r>
               <w:rPr>
-                <w:sz w:val="14"/>
-              </w:rPr>
-              <w:t>/bookings/{id}</w:t>
+                <w:sz w:val="13"/>
+              </w:rPr>
+              <w:t>/bookings</w:t>
             </w:r>
           </w:p>
         </w:tc>
@@ -2800,9 +3181,9 @@
             </w:pPr>
             <w:r>
               <w:rPr>
-                <w:sz w:val="14"/>
-              </w:rPr>
-              <w:t>Detail faktur booking, slot yang diambil, rincian bayar</w:t>
+                <w:sz w:val="13"/>
+              </w:rPr>
+              <w:t>Riwayat transaksi booking milik penyewa aktif</w:t>
             </w:r>
           </w:p>
         </w:tc>
@@ -2817,9 +3198,9 @@
             </w:pPr>
             <w:r>
               <w:rPr>
-                <w:sz w:val="14"/>
-              </w:rPr>
-              <w:t>Penyewa, Pengelola</w:t>
+                <w:sz w:val="13"/>
+              </w:rPr>
+              <w:t>Penyewa</w:t>
             </w:r>
           </w:p>
         </w:tc>
@@ -2834,7 +3215,7 @@
             </w:pPr>
             <w:r>
               <w:rPr>
-                <w:sz w:val="14"/>
+                <w:sz w:val="13"/>
               </w:rPr>
               <w:t>200 OK</w:t>
             </w:r>
@@ -2851,9 +3232,9 @@
             </w:pPr>
             <w:r>
               <w:rPr>
-                <w:sz w:val="14"/>
-              </w:rPr>
-              <w:t>401, 403, 404</w:t>
+                <w:sz w:val="13"/>
+              </w:rPr>
+              <w:t>401</w:t>
             </w:r>
           </w:p>
         </w:tc>
@@ -2870,7 +3251,7 @@
             </w:pPr>
             <w:r>
               <w:rPr>
-                <w:sz w:val="14"/>
+                <w:sz w:val="13"/>
               </w:rPr>
               <w:t>14</w:t>
             </w:r>
@@ -2887,9 +3268,9 @@
             </w:pPr>
             <w:r>
               <w:rPr>
-                <w:sz w:val="14"/>
-              </w:rPr>
-              <w:t>POST</w:t>
+                <w:sz w:val="13"/>
+              </w:rPr>
+              <w:t>GET</w:t>
             </w:r>
           </w:p>
         </w:tc>
@@ -2904,9 +3285,9 @@
             </w:pPr>
             <w:r>
               <w:rPr>
-                <w:sz w:val="14"/>
-              </w:rPr>
-              <w:t>/bookings/{id}/payments</w:t>
+                <w:sz w:val="13"/>
+              </w:rPr>
+              <w:t>/bookings/{id}</w:t>
             </w:r>
           </w:p>
         </w:tc>
@@ -2921,9 +3302,9 @@
             </w:pPr>
             <w:r>
               <w:rPr>
-                <w:sz w:val="14"/>
-              </w:rPr>
-              <w:t>Membuat token transaksi Midtrans Snap &amp; redirect URL</w:t>
+                <w:sz w:val="13"/>
+              </w:rPr>
+              <w:t>Detail faktur booking, slot yang diambil, rincian bayar</w:t>
             </w:r>
           </w:p>
         </w:tc>
@@ -2938,9 +3319,9 @@
             </w:pPr>
             <w:r>
               <w:rPr>
-                <w:sz w:val="14"/>
-              </w:rPr>
-              <w:t>Penyewa</w:t>
+                <w:sz w:val="13"/>
+              </w:rPr>
+              <w:t>Penyewa, Pengelola</w:t>
             </w:r>
           </w:p>
         </w:tc>
@@ -2955,9 +3336,9 @@
             </w:pPr>
             <w:r>
               <w:rPr>
-                <w:sz w:val="14"/>
-              </w:rPr>
-              <w:t>201 Created</w:t>
+                <w:sz w:val="13"/>
+              </w:rPr>
+              <w:t>200 OK</w:t>
             </w:r>
           </w:p>
         </w:tc>
@@ -2972,9 +3353,9 @@
             </w:pPr>
             <w:r>
               <w:rPr>
-                <w:sz w:val="14"/>
-              </w:rPr>
-              <w:t>401, 403, 409</w:t>
+                <w:sz w:val="13"/>
+              </w:rPr>
+              <w:t>401, 403, 404</w:t>
             </w:r>
           </w:p>
         </w:tc>
@@ -2991,7 +3372,7 @@
             </w:pPr>
             <w:r>
               <w:rPr>
-                <w:sz w:val="14"/>
+                <w:sz w:val="13"/>
               </w:rPr>
               <w:t>15</w:t>
             </w:r>
@@ -3008,7 +3389,7 @@
             </w:pPr>
             <w:r>
               <w:rPr>
-                <w:sz w:val="14"/>
+                <w:sz w:val="13"/>
               </w:rPr>
               <w:t>POST</w:t>
             </w:r>
@@ -3025,9 +3406,9 @@
             </w:pPr>
             <w:r>
               <w:rPr>
-                <w:sz w:val="14"/>
-              </w:rPr>
-              <w:t>/bookings/{id}/cancellation</w:t>
+                <w:sz w:val="13"/>
+              </w:rPr>
+              <w:t>/bookings/{id}/payments</w:t>
             </w:r>
           </w:p>
         </w:tc>
@@ -3042,9 +3423,9 @@
             </w:pPr>
             <w:r>
               <w:rPr>
-                <w:sz w:val="14"/>
-              </w:rPr>
-              <w:t>Batalkan booking &amp; hitung refund otomatis kebijakan venue</w:t>
+                <w:sz w:val="13"/>
+              </w:rPr>
+              <w:t>Membuat token transaksi Midtrans Snap &amp; redirect URL</w:t>
             </w:r>
           </w:p>
         </w:tc>
@@ -3059,7 +3440,7 @@
             </w:pPr>
             <w:r>
               <w:rPr>
-                <w:sz w:val="14"/>
+                <w:sz w:val="13"/>
               </w:rPr>
               <w:t>Penyewa</w:t>
             </w:r>
@@ -3076,9 +3457,9 @@
             </w:pPr>
             <w:r>
               <w:rPr>
-                <w:sz w:val="14"/>
-              </w:rPr>
-              <w:t>200 OK</w:t>
+                <w:sz w:val="13"/>
+              </w:rPr>
+              <w:t>201 Created</w:t>
             </w:r>
           </w:p>
         </w:tc>
@@ -3093,7 +3474,7 @@
             </w:pPr>
             <w:r>
               <w:rPr>
-                <w:sz w:val="14"/>
+                <w:sz w:val="13"/>
               </w:rPr>
               <w:t>401, 403, 409</w:t>
             </w:r>
@@ -3112,7 +3493,7 @@
             </w:pPr>
             <w:r>
               <w:rPr>
-                <w:sz w:val="14"/>
+                <w:sz w:val="13"/>
               </w:rPr>
               <w:t>16</w:t>
             </w:r>
@@ -3129,7 +3510,7 @@
             </w:pPr>
             <w:r>
               <w:rPr>
-                <w:sz w:val="14"/>
+                <w:sz w:val="13"/>
               </w:rPr>
               <w:t>POST</w:t>
             </w:r>
@@ -3146,9 +3527,9 @@
             </w:pPr>
             <w:r>
               <w:rPr>
-                <w:sz w:val="14"/>
-              </w:rPr>
-              <w:t>/payments/webhook/midtrans</w:t>
+                <w:sz w:val="13"/>
+              </w:rPr>
+              <w:t>/bookings/{id}/cancellation</w:t>
             </w:r>
           </w:p>
         </w:tc>
@@ -3163,9 +3544,9 @@
             </w:pPr>
             <w:r>
               <w:rPr>
-                <w:sz w:val="14"/>
-              </w:rPr>
-              <w:t>Callback notifikasi gateway (verifikasi HMAC SHA-512)</w:t>
+                <w:sz w:val="13"/>
+              </w:rPr>
+              <w:t>Batalkan booking &amp; hitung refund otomatis kebijakan venue</w:t>
             </w:r>
           </w:p>
         </w:tc>
@@ -3180,9 +3561,9 @@
             </w:pPr>
             <w:r>
               <w:rPr>
-                <w:sz w:val="14"/>
-              </w:rPr>
-              <w:t>Midtrans</w:t>
+                <w:sz w:val="13"/>
+              </w:rPr>
+              <w:t>Penyewa</w:t>
             </w:r>
           </w:p>
         </w:tc>
@@ -3197,7 +3578,7 @@
             </w:pPr>
             <w:r>
               <w:rPr>
-                <w:sz w:val="14"/>
+                <w:sz w:val="13"/>
               </w:rPr>
               <w:t>200 OK</w:t>
             </w:r>
@@ -3214,9 +3595,9 @@
             </w:pPr>
             <w:r>
               <w:rPr>
-                <w:sz w:val="14"/>
-              </w:rPr>
-              <w:t>401, 403</w:t>
+                <w:sz w:val="13"/>
+              </w:rPr>
+              <w:t>401, 403, 409</w:t>
             </w:r>
           </w:p>
         </w:tc>
@@ -3233,7 +3614,7 @@
             </w:pPr>
             <w:r>
               <w:rPr>
-                <w:sz w:val="14"/>
+                <w:sz w:val="13"/>
               </w:rPr>
               <w:t>17</w:t>
             </w:r>
@@ -3250,7 +3631,7 @@
             </w:pPr>
             <w:r>
               <w:rPr>
-                <w:sz w:val="14"/>
+                <w:sz w:val="13"/>
               </w:rPr>
               <w:t>POST</w:t>
             </w:r>
@@ -3267,9 +3648,9 @@
             </w:pPr>
             <w:r>
               <w:rPr>
-                <w:sz w:val="14"/>
-              </w:rPr>
-              <w:t>/manage/courts</w:t>
+                <w:sz w:val="13"/>
+              </w:rPr>
+              <w:t>/payments/webhook/midtrans</w:t>
             </w:r>
           </w:p>
         </w:tc>
@@ -3284,9 +3665,9 @@
             </w:pPr>
             <w:r>
               <w:rPr>
-                <w:sz w:val="14"/>
-              </w:rPr>
-              <w:t>Menambah lapangan baru pada venue milik pengelola</w:t>
+                <w:sz w:val="13"/>
+              </w:rPr>
+              <w:t>Callback notifikasi gateway (verifikasi HMAC SHA-512)</w:t>
             </w:r>
           </w:p>
         </w:tc>
@@ -3301,9 +3682,9 @@
             </w:pPr>
             <w:r>
               <w:rPr>
-                <w:sz w:val="14"/>
-              </w:rPr>
-              <w:t>Pengelola</w:t>
+                <w:sz w:val="13"/>
+              </w:rPr>
+              <w:t>Midtrans</w:t>
             </w:r>
           </w:p>
         </w:tc>
@@ -3318,9 +3699,9 @@
             </w:pPr>
             <w:r>
               <w:rPr>
-                <w:sz w:val="14"/>
-              </w:rPr>
-              <w:t>201 Created</w:t>
+                <w:sz w:val="13"/>
+              </w:rPr>
+              <w:t>200 OK</w:t>
             </w:r>
           </w:p>
         </w:tc>
@@ -3335,9 +3716,9 @@
             </w:pPr>
             <w:r>
               <w:rPr>
-                <w:sz w:val="14"/>
-              </w:rPr>
-              <w:t>401, 403, 422</w:t>
+                <w:sz w:val="13"/>
+              </w:rPr>
+              <w:t>401, 403</w:t>
             </w:r>
           </w:p>
         </w:tc>
@@ -3354,7 +3735,7 @@
             </w:pPr>
             <w:r>
               <w:rPr>
-                <w:sz w:val="14"/>
+                <w:sz w:val="13"/>
               </w:rPr>
               <w:t>18</w:t>
             </w:r>
@@ -3371,9 +3752,9 @@
             </w:pPr>
             <w:r>
               <w:rPr>
-                <w:sz w:val="14"/>
-              </w:rPr>
-              <w:t>PUT</w:t>
+                <w:sz w:val="13"/>
+              </w:rPr>
+              <w:t>POST</w:t>
             </w:r>
           </w:p>
         </w:tc>
@@ -3388,9 +3769,9 @@
             </w:pPr>
             <w:r>
               <w:rPr>
-                <w:sz w:val="14"/>
-              </w:rPr>
-              <w:t>/manage/courts/{id}</w:t>
+                <w:sz w:val="13"/>
+              </w:rPr>
+              <w:t>/manage/venues</w:t>
             </w:r>
           </w:p>
         </w:tc>
@@ -3405,9 +3786,9 @@
             </w:pPr>
             <w:r>
               <w:rPr>
-                <w:sz w:val="14"/>
-              </w:rPr>
-              <w:t>Memperbarui spesifikasi lapangan secara menyeluruh</w:t>
+                <w:sz w:val="13"/>
+              </w:rPr>
+              <w:t>Mendaftarkan venue baru milik pengelola</w:t>
             </w:r>
           </w:p>
         </w:tc>
@@ -3422,7 +3803,7 @@
             </w:pPr>
             <w:r>
               <w:rPr>
-                <w:sz w:val="14"/>
+                <w:sz w:val="13"/>
               </w:rPr>
               <w:t>Pengelola</w:t>
             </w:r>
@@ -3439,9 +3820,9 @@
             </w:pPr>
             <w:r>
               <w:rPr>
-                <w:sz w:val="14"/>
-              </w:rPr>
-              <w:t>200 OK</w:t>
+                <w:sz w:val="13"/>
+              </w:rPr>
+              <w:t>201 Created</w:t>
             </w:r>
           </w:p>
         </w:tc>
@@ -3456,9 +3837,9 @@
             </w:pPr>
             <w:r>
               <w:rPr>
-                <w:sz w:val="14"/>
-              </w:rPr>
-              <w:t>401, 403, 404, 422</w:t>
+                <w:sz w:val="13"/>
+              </w:rPr>
+              <w:t>401, 403, 422</w:t>
             </w:r>
           </w:p>
         </w:tc>
@@ -3475,7 +3856,7 @@
             </w:pPr>
             <w:r>
               <w:rPr>
-                <w:sz w:val="14"/>
+                <w:sz w:val="13"/>
               </w:rPr>
               <w:t>19</w:t>
             </w:r>
@@ -3492,9 +3873,9 @@
             </w:pPr>
             <w:r>
               <w:rPr>
-                <w:sz w:val="14"/>
-              </w:rPr>
-              <w:t>PATCH</w:t>
+                <w:sz w:val="13"/>
+              </w:rPr>
+              <w:t>PUT</w:t>
             </w:r>
           </w:p>
         </w:tc>
@@ -3509,9 +3890,9 @@
             </w:pPr>
             <w:r>
               <w:rPr>
-                <w:sz w:val="14"/>
-              </w:rPr>
-              <w:t>/manage/courts/{id}</w:t>
+                <w:sz w:val="13"/>
+              </w:rPr>
+              <w:t>/manage/venues/{id}</w:t>
             </w:r>
           </w:p>
         </w:tc>
@@ -3526,9 +3907,9 @@
             </w:pPr>
             <w:r>
               <w:rPr>
-                <w:sz w:val="14"/>
-              </w:rPr>
-              <w:t>Mengubah status aktif/non-aktif lapangan parsial</w:t>
+                <w:sz w:val="13"/>
+              </w:rPr>
+              <w:t>Memperbarui profil venue secara menyeluruh</w:t>
             </w:r>
           </w:p>
         </w:tc>
@@ -3543,7 +3924,7 @@
             </w:pPr>
             <w:r>
               <w:rPr>
-                <w:sz w:val="14"/>
+                <w:sz w:val="13"/>
               </w:rPr>
               <w:t>Pengelola</w:t>
             </w:r>
@@ -3560,7 +3941,7 @@
             </w:pPr>
             <w:r>
               <w:rPr>
-                <w:sz w:val="14"/>
+                <w:sz w:val="13"/>
               </w:rPr>
               <w:t>200 OK</w:t>
             </w:r>
@@ -3577,9 +3958,9 @@
             </w:pPr>
             <w:r>
               <w:rPr>
-                <w:sz w:val="14"/>
-              </w:rPr>
-              <w:t>401, 403, 404</w:t>
+                <w:sz w:val="13"/>
+              </w:rPr>
+              <w:t>401, 403, 404, 422</w:t>
             </w:r>
           </w:p>
         </w:tc>
@@ -3596,7 +3977,7 @@
             </w:pPr>
             <w:r>
               <w:rPr>
-                <w:sz w:val="14"/>
+                <w:sz w:val="13"/>
               </w:rPr>
               <w:t>20</w:t>
             </w:r>
@@ -3613,7 +3994,7 @@
             </w:pPr>
             <w:r>
               <w:rPr>
-                <w:sz w:val="14"/>
+                <w:sz w:val="13"/>
               </w:rPr>
               <w:t>DELETE</w:t>
             </w:r>
@@ -3630,9 +4011,9 @@
             </w:pPr>
             <w:r>
               <w:rPr>
-                <w:sz w:val="14"/>
-              </w:rPr>
-              <w:t>/manage/courts/{id}</w:t>
+                <w:sz w:val="13"/>
+              </w:rPr>
+              <w:t>/manage/venues/{id}</w:t>
             </w:r>
           </w:p>
         </w:tc>
@@ -3647,9 +4028,9 @@
             </w:pPr>
             <w:r>
               <w:rPr>
-                <w:sz w:val="14"/>
-              </w:rPr>
-              <w:t>Menghapus/menonaktifkan lapangan fisik dari sistem</w:t>
+                <w:sz w:val="13"/>
+              </w:rPr>
+              <w:t>Menghapus/menonaktifkan venue dari platform</w:t>
             </w:r>
           </w:p>
         </w:tc>
@@ -3664,7 +4045,7 @@
             </w:pPr>
             <w:r>
               <w:rPr>
-                <w:sz w:val="14"/>
+                <w:sz w:val="13"/>
               </w:rPr>
               <w:t>Pengelola</w:t>
             </w:r>
@@ -3681,7 +4062,7 @@
             </w:pPr>
             <w:r>
               <w:rPr>
-                <w:sz w:val="14"/>
+                <w:sz w:val="13"/>
               </w:rPr>
               <w:t>204 No Content</w:t>
             </w:r>
@@ -3698,7 +4079,7 @@
             </w:pPr>
             <w:r>
               <w:rPr>
-                <w:sz w:val="14"/>
+                <w:sz w:val="13"/>
               </w:rPr>
               <w:t>401, 403, 404, 409</w:t>
             </w:r>
@@ -3717,7 +4098,7 @@
             </w:pPr>
             <w:r>
               <w:rPr>
-                <w:sz w:val="14"/>
+                <w:sz w:val="13"/>
               </w:rPr>
               <w:t>21</w:t>
             </w:r>
@@ -3734,7 +4115,7 @@
             </w:pPr>
             <w:r>
               <w:rPr>
-                <w:sz w:val="14"/>
+                <w:sz w:val="13"/>
               </w:rPr>
               <w:t>POST</w:t>
             </w:r>
@@ -3751,9 +4132,9 @@
             </w:pPr>
             <w:r>
               <w:rPr>
-                <w:sz w:val="14"/>
-              </w:rPr>
-              <w:t>/manage/courts/{id}/blocks</w:t>
+                <w:sz w:val="13"/>
+              </w:rPr>
+              <w:t>/manage/courts</w:t>
             </w:r>
           </w:p>
         </w:tc>
@@ -3768,9 +4149,9 @@
             </w:pPr>
             <w:r>
               <w:rPr>
-                <w:sz w:val="14"/>
-              </w:rPr>
-              <w:t>Membuat blokir slot perawatan/turnamen</w:t>
+                <w:sz w:val="13"/>
+              </w:rPr>
+              <w:t>Menambah lapangan baru pada venue milik pengelola</w:t>
             </w:r>
           </w:p>
         </w:tc>
@@ -3785,7 +4166,7 @@
             </w:pPr>
             <w:r>
               <w:rPr>
-                <w:sz w:val="14"/>
+                <w:sz w:val="13"/>
               </w:rPr>
               <w:t>Pengelola</w:t>
             </w:r>
@@ -3802,7 +4183,7 @@
             </w:pPr>
             <w:r>
               <w:rPr>
-                <w:sz w:val="14"/>
+                <w:sz w:val="13"/>
               </w:rPr>
               <w:t>201 Created</w:t>
             </w:r>
@@ -3819,7 +4200,7 @@
             </w:pPr>
             <w:r>
               <w:rPr>
-                <w:sz w:val="14"/>
+                <w:sz w:val="13"/>
               </w:rPr>
               <w:t>401, 403, 422</w:t>
             </w:r>
@@ -3838,7 +4219,7 @@
             </w:pPr>
             <w:r>
               <w:rPr>
-                <w:sz w:val="14"/>
+                <w:sz w:val="13"/>
               </w:rPr>
               <w:t>22</w:t>
             </w:r>
@@ -3855,9 +4236,9 @@
             </w:pPr>
             <w:r>
               <w:rPr>
-                <w:sz w:val="14"/>
-              </w:rPr>
-              <w:t>DELETE</w:t>
+                <w:sz w:val="13"/>
+              </w:rPr>
+              <w:t>PUT</w:t>
             </w:r>
           </w:p>
         </w:tc>
@@ -3872,9 +4253,9 @@
             </w:pPr>
             <w:r>
               <w:rPr>
-                <w:sz w:val="14"/>
-              </w:rPr>
-              <w:t>/manage/blocks/{id}</w:t>
+                <w:sz w:val="13"/>
+              </w:rPr>
+              <w:t>/manage/courts/{id}</w:t>
             </w:r>
           </w:p>
         </w:tc>
@@ -3889,9 +4270,9 @@
             </w:pPr>
             <w:r>
               <w:rPr>
-                <w:sz w:val="14"/>
-              </w:rPr>
-              <w:t>Membatalkan jadwal pemblokiran lapangan fisik</w:t>
+                <w:sz w:val="13"/>
+              </w:rPr>
+              <w:t>Memperbarui spesifikasi lapangan secara menyeluruh</w:t>
             </w:r>
           </w:p>
         </w:tc>
@@ -3906,7 +4287,7 @@
             </w:pPr>
             <w:r>
               <w:rPr>
-                <w:sz w:val="14"/>
+                <w:sz w:val="13"/>
               </w:rPr>
               <w:t>Pengelola</w:t>
             </w:r>
@@ -3923,9 +4304,9 @@
             </w:pPr>
             <w:r>
               <w:rPr>
-                <w:sz w:val="14"/>
-              </w:rPr>
-              <w:t>204 No Content</w:t>
+                <w:sz w:val="13"/>
+              </w:rPr>
+              <w:t>200 OK</w:t>
             </w:r>
           </w:p>
         </w:tc>
@@ -3940,9 +4321,9 @@
             </w:pPr>
             <w:r>
               <w:rPr>
-                <w:sz w:val="14"/>
-              </w:rPr>
-              <w:t>401, 403, 404</w:t>
+                <w:sz w:val="13"/>
+              </w:rPr>
+              <w:t>401, 403, 404, 422</w:t>
             </w:r>
           </w:p>
         </w:tc>
@@ -3959,7 +4340,7 @@
             </w:pPr>
             <w:r>
               <w:rPr>
-                <w:sz w:val="14"/>
+                <w:sz w:val="13"/>
               </w:rPr>
               <w:t>23</w:t>
             </w:r>
@@ -3976,7 +4357,7 @@
             </w:pPr>
             <w:r>
               <w:rPr>
-                <w:sz w:val="14"/>
+                <w:sz w:val="13"/>
               </w:rPr>
               <w:t>PATCH</w:t>
             </w:r>
@@ -3993,9 +4374,9 @@
             </w:pPr>
             <w:r>
               <w:rPr>
-                <w:sz w:val="14"/>
-              </w:rPr>
-              <w:t>/manage/bookings/{id}/status</w:t>
+                <w:sz w:val="13"/>
+              </w:rPr>
+              <w:t>/manage/courts/{id}</w:t>
             </w:r>
           </w:p>
         </w:tc>
@@ -4010,9 +4391,9 @@
             </w:pPr>
             <w:r>
               <w:rPr>
-                <w:sz w:val="14"/>
-              </w:rPr>
-              <w:t>Mengubah status sewa menjadi COMPLETED / NO_SHOW</w:t>
+                <w:sz w:val="13"/>
+              </w:rPr>
+              <w:t>Mengubah status aktif/non-aktif lapangan parsial</w:t>
             </w:r>
           </w:p>
         </w:tc>
@@ -4027,7 +4408,7 @@
             </w:pPr>
             <w:r>
               <w:rPr>
-                <w:sz w:val="14"/>
+                <w:sz w:val="13"/>
               </w:rPr>
               <w:t>Pengelola</w:t>
             </w:r>
@@ -4044,7 +4425,7 @@
             </w:pPr>
             <w:r>
               <w:rPr>
-                <w:sz w:val="14"/>
+                <w:sz w:val="13"/>
               </w:rPr>
               <w:t>200 OK</w:t>
             </w:r>
@@ -4061,9 +4442,9 @@
             </w:pPr>
             <w:r>
               <w:rPr>
-                <w:sz w:val="14"/>
-              </w:rPr>
-              <w:t>401, 403, 422</w:t>
+                <w:sz w:val="13"/>
+              </w:rPr>
+              <w:t>401, 403, 404</w:t>
             </w:r>
           </w:p>
         </w:tc>
@@ -4080,7 +4461,7 @@
             </w:pPr>
             <w:r>
               <w:rPr>
-                <w:sz w:val="14"/>
+                <w:sz w:val="13"/>
               </w:rPr>
               <w:t>24</w:t>
             </w:r>
@@ -4097,9 +4478,9 @@
             </w:pPr>
             <w:r>
               <w:rPr>
-                <w:sz w:val="14"/>
-              </w:rPr>
-              <w:t>GET</w:t>
+                <w:sz w:val="13"/>
+              </w:rPr>
+              <w:t>DELETE</w:t>
             </w:r>
           </w:p>
         </w:tc>
@@ -4114,9 +4495,9 @@
             </w:pPr>
             <w:r>
               <w:rPr>
-                <w:sz w:val="14"/>
-              </w:rPr>
-              <w:t>/admin/users</w:t>
+                <w:sz w:val="13"/>
+              </w:rPr>
+              <w:t>/manage/courts/{id}</w:t>
             </w:r>
           </w:p>
         </w:tc>
@@ -4131,9 +4512,9 @@
             </w:pPr>
             <w:r>
               <w:rPr>
-                <w:sz w:val="14"/>
-              </w:rPr>
-              <w:t>Daftar seluruh akun pengguna platform (filter role &amp; status)</w:t>
+                <w:sz w:val="13"/>
+              </w:rPr>
+              <w:t>Menghapus/menonaktifkan lapangan fisik dari sistem</w:t>
             </w:r>
           </w:p>
         </w:tc>
@@ -4148,9 +4529,9 @@
             </w:pPr>
             <w:r>
               <w:rPr>
-                <w:sz w:val="14"/>
-              </w:rPr>
-              <w:t>Admin</w:t>
+                <w:sz w:val="13"/>
+              </w:rPr>
+              <w:t>Pengelola</w:t>
             </w:r>
           </w:p>
         </w:tc>
@@ -4165,9 +4546,9 @@
             </w:pPr>
             <w:r>
               <w:rPr>
-                <w:sz w:val="14"/>
-              </w:rPr>
-              <w:t>200 OK</w:t>
+                <w:sz w:val="13"/>
+              </w:rPr>
+              <w:t>204 No Content</w:t>
             </w:r>
           </w:p>
         </w:tc>
@@ -4182,9 +4563,9 @@
             </w:pPr>
             <w:r>
               <w:rPr>
-                <w:sz w:val="14"/>
-              </w:rPr>
-              <w:t>401, 403</w:t>
+                <w:sz w:val="13"/>
+              </w:rPr>
+              <w:t>401, 403, 404, 409</w:t>
             </w:r>
           </w:p>
         </w:tc>
@@ -4201,7 +4582,7 @@
             </w:pPr>
             <w:r>
               <w:rPr>
-                <w:sz w:val="14"/>
+                <w:sz w:val="13"/>
               </w:rPr>
               <w:t>25</w:t>
             </w:r>
@@ -4218,9 +4599,9 @@
             </w:pPr>
             <w:r>
               <w:rPr>
-                <w:sz w:val="14"/>
-              </w:rPr>
-              <w:t>PATCH</w:t>
+                <w:sz w:val="13"/>
+              </w:rPr>
+              <w:t>POST</w:t>
             </w:r>
           </w:p>
         </w:tc>
@@ -4235,9 +4616,9 @@
             </w:pPr>
             <w:r>
               <w:rPr>
-                <w:sz w:val="14"/>
-              </w:rPr>
-              <w:t>/admin/users/{id}/verify</w:t>
+                <w:sz w:val="13"/>
+              </w:rPr>
+              <w:t>/manage/prices</w:t>
             </w:r>
           </w:p>
         </w:tc>
@@ -4252,9 +4633,9 @@
             </w:pPr>
             <w:r>
               <w:rPr>
-                <w:sz w:val="14"/>
-              </w:rPr>
-              <w:t>Verifikasi dan aktivasi kemitraan akun pengelola baru</w:t>
+                <w:sz w:val="13"/>
+              </w:rPr>
+              <w:t>Menambahkan aturan konfigurasi tarif sewa</w:t>
             </w:r>
           </w:p>
         </w:tc>
@@ -4269,9 +4650,9 @@
             </w:pPr>
             <w:r>
               <w:rPr>
-                <w:sz w:val="14"/>
-              </w:rPr>
-              <w:t>Admin</w:t>
+                <w:sz w:val="13"/>
+              </w:rPr>
+              <w:t>Pengelola</w:t>
             </w:r>
           </w:p>
         </w:tc>
@@ -4286,9 +4667,9 @@
             </w:pPr>
             <w:r>
               <w:rPr>
-                <w:sz w:val="14"/>
-              </w:rPr>
-              <w:t>200 OK</w:t>
+                <w:sz w:val="13"/>
+              </w:rPr>
+              <w:t>201 Created</w:t>
             </w:r>
           </w:p>
         </w:tc>
@@ -4303,7 +4684,733 @@
             </w:pPr>
             <w:r>
               <w:rPr>
-                <w:sz w:val="14"/>
+                <w:sz w:val="13"/>
+              </w:rPr>
+              <w:t>401, 403, 422</w:t>
+            </w:r>
+          </w:p>
+        </w:tc>
+      </w:tr>
+      <w:tr>
+        <w:tc>
+          <w:tcPr>
+            <w:tcW w:type="dxa" w:w="1502"/>
+            <w:shd w:fill="F8FAFC"/>
+          </w:tcPr>
+          <w:p>
+            <w:pPr>
+              <w:spacing w:after="20" w:before="20"/>
+            </w:pPr>
+            <w:r>
+              <w:rPr>
+                <w:sz w:val="13"/>
+              </w:rPr>
+              <w:t>26</w:t>
+            </w:r>
+          </w:p>
+        </w:tc>
+        <w:tc>
+          <w:tcPr>
+            <w:tcW w:type="dxa" w:w="1502"/>
+            <w:shd w:fill="F8FAFC"/>
+          </w:tcPr>
+          <w:p>
+            <w:pPr>
+              <w:spacing w:after="20" w:before="20"/>
+            </w:pPr>
+            <w:r>
+              <w:rPr>
+                <w:sz w:val="13"/>
+              </w:rPr>
+              <w:t>DELETE</w:t>
+            </w:r>
+          </w:p>
+        </w:tc>
+        <w:tc>
+          <w:tcPr>
+            <w:tcW w:type="dxa" w:w="1502"/>
+            <w:shd w:fill="F8FAFC"/>
+          </w:tcPr>
+          <w:p>
+            <w:pPr>
+              <w:spacing w:after="20" w:before="20"/>
+            </w:pPr>
+            <w:r>
+              <w:rPr>
+                <w:sz w:val="13"/>
+              </w:rPr>
+              <w:t>/manage/prices/{id}</w:t>
+            </w:r>
+          </w:p>
+        </w:tc>
+        <w:tc>
+          <w:tcPr>
+            <w:tcW w:type="dxa" w:w="1502"/>
+            <w:shd w:fill="F8FAFC"/>
+          </w:tcPr>
+          <w:p>
+            <w:pPr>
+              <w:spacing w:after="20" w:before="20"/>
+            </w:pPr>
+            <w:r>
+              <w:rPr>
+                <w:sz w:val="13"/>
+              </w:rPr>
+              <w:t>Menghapus aturan konfigurasi tarif sewa</w:t>
+            </w:r>
+          </w:p>
+        </w:tc>
+        <w:tc>
+          <w:tcPr>
+            <w:tcW w:type="dxa" w:w="1502"/>
+            <w:shd w:fill="F8FAFC"/>
+          </w:tcPr>
+          <w:p>
+            <w:pPr>
+              <w:spacing w:after="20" w:before="20"/>
+            </w:pPr>
+            <w:r>
+              <w:rPr>
+                <w:sz w:val="13"/>
+              </w:rPr>
+              <w:t>Pengelola</w:t>
+            </w:r>
+          </w:p>
+        </w:tc>
+        <w:tc>
+          <w:tcPr>
+            <w:tcW w:type="dxa" w:w="1502"/>
+            <w:shd w:fill="F8FAFC"/>
+          </w:tcPr>
+          <w:p>
+            <w:pPr>
+              <w:spacing w:after="20" w:before="20"/>
+            </w:pPr>
+            <w:r>
+              <w:rPr>
+                <w:sz w:val="13"/>
+              </w:rPr>
+              <w:t>204 No Content</w:t>
+            </w:r>
+          </w:p>
+        </w:tc>
+        <w:tc>
+          <w:tcPr>
+            <w:tcW w:type="dxa" w:w="1502"/>
+            <w:shd w:fill="F8FAFC"/>
+          </w:tcPr>
+          <w:p>
+            <w:pPr>
+              <w:spacing w:after="20" w:before="20"/>
+            </w:pPr>
+            <w:r>
+              <w:rPr>
+                <w:sz w:val="13"/>
+              </w:rPr>
+              <w:t>401, 403, 404</w:t>
+            </w:r>
+          </w:p>
+        </w:tc>
+      </w:tr>
+      <w:tr>
+        <w:tc>
+          <w:tcPr>
+            <w:tcW w:type="dxa" w:w="1502"/>
+            <w:shd w:fill="FFFFFF"/>
+          </w:tcPr>
+          <w:p>
+            <w:pPr>
+              <w:spacing w:after="20" w:before="20"/>
+            </w:pPr>
+            <w:r>
+              <w:rPr>
+                <w:sz w:val="13"/>
+              </w:rPr>
+              <w:t>27</w:t>
+            </w:r>
+          </w:p>
+        </w:tc>
+        <w:tc>
+          <w:tcPr>
+            <w:tcW w:type="dxa" w:w="1502"/>
+            <w:shd w:fill="FFFFFF"/>
+          </w:tcPr>
+          <w:p>
+            <w:pPr>
+              <w:spacing w:after="20" w:before="20"/>
+            </w:pPr>
+            <w:r>
+              <w:rPr>
+                <w:sz w:val="13"/>
+              </w:rPr>
+              <w:t>POST</w:t>
+            </w:r>
+          </w:p>
+        </w:tc>
+        <w:tc>
+          <w:tcPr>
+            <w:tcW w:type="dxa" w:w="1502"/>
+            <w:shd w:fill="FFFFFF"/>
+          </w:tcPr>
+          <w:p>
+            <w:pPr>
+              <w:spacing w:after="20" w:before="20"/>
+            </w:pPr>
+            <w:r>
+              <w:rPr>
+                <w:sz w:val="13"/>
+              </w:rPr>
+              <w:t>/manage/blocks</w:t>
+            </w:r>
+          </w:p>
+        </w:tc>
+        <w:tc>
+          <w:tcPr>
+            <w:tcW w:type="dxa" w:w="1502"/>
+            <w:shd w:fill="FFFFFF"/>
+          </w:tcPr>
+          <w:p>
+            <w:pPr>
+              <w:spacing w:after="20" w:before="20"/>
+            </w:pPr>
+            <w:r>
+              <w:rPr>
+                <w:sz w:val="13"/>
+              </w:rPr>
+              <w:t>Membuat jadwal pemblokiran slot perawatan/turnamen</w:t>
+            </w:r>
+          </w:p>
+        </w:tc>
+        <w:tc>
+          <w:tcPr>
+            <w:tcW w:type="dxa" w:w="1502"/>
+            <w:shd w:fill="FFFFFF"/>
+          </w:tcPr>
+          <w:p>
+            <w:pPr>
+              <w:spacing w:after="20" w:before="20"/>
+            </w:pPr>
+            <w:r>
+              <w:rPr>
+                <w:sz w:val="13"/>
+              </w:rPr>
+              <w:t>Pengelola</w:t>
+            </w:r>
+          </w:p>
+        </w:tc>
+        <w:tc>
+          <w:tcPr>
+            <w:tcW w:type="dxa" w:w="1502"/>
+            <w:shd w:fill="FFFFFF"/>
+          </w:tcPr>
+          <w:p>
+            <w:pPr>
+              <w:spacing w:after="20" w:before="20"/>
+            </w:pPr>
+            <w:r>
+              <w:rPr>
+                <w:sz w:val="13"/>
+              </w:rPr>
+              <w:t>201 Created</w:t>
+            </w:r>
+          </w:p>
+        </w:tc>
+        <w:tc>
+          <w:tcPr>
+            <w:tcW w:type="dxa" w:w="1502"/>
+            <w:shd w:fill="FFFFFF"/>
+          </w:tcPr>
+          <w:p>
+            <w:pPr>
+              <w:spacing w:after="20" w:before="20"/>
+            </w:pPr>
+            <w:r>
+              <w:rPr>
+                <w:sz w:val="13"/>
+              </w:rPr>
+              <w:t>401, 403, 422</w:t>
+            </w:r>
+          </w:p>
+        </w:tc>
+      </w:tr>
+      <w:tr>
+        <w:tc>
+          <w:tcPr>
+            <w:tcW w:type="dxa" w:w="1502"/>
+            <w:shd w:fill="F8FAFC"/>
+          </w:tcPr>
+          <w:p>
+            <w:pPr>
+              <w:spacing w:after="20" w:before="20"/>
+            </w:pPr>
+            <w:r>
+              <w:rPr>
+                <w:sz w:val="13"/>
+              </w:rPr>
+              <w:t>28</w:t>
+            </w:r>
+          </w:p>
+        </w:tc>
+        <w:tc>
+          <w:tcPr>
+            <w:tcW w:type="dxa" w:w="1502"/>
+            <w:shd w:fill="F8FAFC"/>
+          </w:tcPr>
+          <w:p>
+            <w:pPr>
+              <w:spacing w:after="20" w:before="20"/>
+            </w:pPr>
+            <w:r>
+              <w:rPr>
+                <w:sz w:val="13"/>
+              </w:rPr>
+              <w:t>DELETE</w:t>
+            </w:r>
+          </w:p>
+        </w:tc>
+        <w:tc>
+          <w:tcPr>
+            <w:tcW w:type="dxa" w:w="1502"/>
+            <w:shd w:fill="F8FAFC"/>
+          </w:tcPr>
+          <w:p>
+            <w:pPr>
+              <w:spacing w:after="20" w:before="20"/>
+            </w:pPr>
+            <w:r>
+              <w:rPr>
+                <w:sz w:val="13"/>
+              </w:rPr>
+              <w:t>/manage/blocks/{id}</w:t>
+            </w:r>
+          </w:p>
+        </w:tc>
+        <w:tc>
+          <w:tcPr>
+            <w:tcW w:type="dxa" w:w="1502"/>
+            <w:shd w:fill="F8FAFC"/>
+          </w:tcPr>
+          <w:p>
+            <w:pPr>
+              <w:spacing w:after="20" w:before="20"/>
+            </w:pPr>
+            <w:r>
+              <w:rPr>
+                <w:sz w:val="13"/>
+              </w:rPr>
+              <w:t>Membatalkan jadwal pemblokiran lapangan fisik</w:t>
+            </w:r>
+          </w:p>
+        </w:tc>
+        <w:tc>
+          <w:tcPr>
+            <w:tcW w:type="dxa" w:w="1502"/>
+            <w:shd w:fill="F8FAFC"/>
+          </w:tcPr>
+          <w:p>
+            <w:pPr>
+              <w:spacing w:after="20" w:before="20"/>
+            </w:pPr>
+            <w:r>
+              <w:rPr>
+                <w:sz w:val="13"/>
+              </w:rPr>
+              <w:t>Pengelola</w:t>
+            </w:r>
+          </w:p>
+        </w:tc>
+        <w:tc>
+          <w:tcPr>
+            <w:tcW w:type="dxa" w:w="1502"/>
+            <w:shd w:fill="F8FAFC"/>
+          </w:tcPr>
+          <w:p>
+            <w:pPr>
+              <w:spacing w:after="20" w:before="20"/>
+            </w:pPr>
+            <w:r>
+              <w:rPr>
+                <w:sz w:val="13"/>
+              </w:rPr>
+              <w:t>204 No Content</w:t>
+            </w:r>
+          </w:p>
+        </w:tc>
+        <w:tc>
+          <w:tcPr>
+            <w:tcW w:type="dxa" w:w="1502"/>
+            <w:shd w:fill="F8FAFC"/>
+          </w:tcPr>
+          <w:p>
+            <w:pPr>
+              <w:spacing w:after="20" w:before="20"/>
+            </w:pPr>
+            <w:r>
+              <w:rPr>
+                <w:sz w:val="13"/>
+              </w:rPr>
+              <w:t>401, 403, 404</w:t>
+            </w:r>
+          </w:p>
+        </w:tc>
+      </w:tr>
+      <w:tr>
+        <w:tc>
+          <w:tcPr>
+            <w:tcW w:type="dxa" w:w="1502"/>
+            <w:shd w:fill="FFFFFF"/>
+          </w:tcPr>
+          <w:p>
+            <w:pPr>
+              <w:spacing w:after="20" w:before="20"/>
+            </w:pPr>
+            <w:r>
+              <w:rPr>
+                <w:sz w:val="13"/>
+              </w:rPr>
+              <w:t>29</w:t>
+            </w:r>
+          </w:p>
+        </w:tc>
+        <w:tc>
+          <w:tcPr>
+            <w:tcW w:type="dxa" w:w="1502"/>
+            <w:shd w:fill="FFFFFF"/>
+          </w:tcPr>
+          <w:p>
+            <w:pPr>
+              <w:spacing w:after="20" w:before="20"/>
+            </w:pPr>
+            <w:r>
+              <w:rPr>
+                <w:sz w:val="13"/>
+              </w:rPr>
+              <w:t>PATCH</w:t>
+            </w:r>
+          </w:p>
+        </w:tc>
+        <w:tc>
+          <w:tcPr>
+            <w:tcW w:type="dxa" w:w="1502"/>
+            <w:shd w:fill="FFFFFF"/>
+          </w:tcPr>
+          <w:p>
+            <w:pPr>
+              <w:spacing w:after="20" w:before="20"/>
+            </w:pPr>
+            <w:r>
+              <w:rPr>
+                <w:sz w:val="13"/>
+              </w:rPr>
+              <w:t>/manage/bookings/{id}/status</w:t>
+            </w:r>
+          </w:p>
+        </w:tc>
+        <w:tc>
+          <w:tcPr>
+            <w:tcW w:type="dxa" w:w="1502"/>
+            <w:shd w:fill="FFFFFF"/>
+          </w:tcPr>
+          <w:p>
+            <w:pPr>
+              <w:spacing w:after="20" w:before="20"/>
+            </w:pPr>
+            <w:r>
+              <w:rPr>
+                <w:sz w:val="13"/>
+              </w:rPr>
+              <w:t>Mengubah status sewa menjadi COMPLETED / NO_SHOW</w:t>
+            </w:r>
+          </w:p>
+        </w:tc>
+        <w:tc>
+          <w:tcPr>
+            <w:tcW w:type="dxa" w:w="1502"/>
+            <w:shd w:fill="FFFFFF"/>
+          </w:tcPr>
+          <w:p>
+            <w:pPr>
+              <w:spacing w:after="20" w:before="20"/>
+            </w:pPr>
+            <w:r>
+              <w:rPr>
+                <w:sz w:val="13"/>
+              </w:rPr>
+              <w:t>Pengelola</w:t>
+            </w:r>
+          </w:p>
+        </w:tc>
+        <w:tc>
+          <w:tcPr>
+            <w:tcW w:type="dxa" w:w="1502"/>
+            <w:shd w:fill="FFFFFF"/>
+          </w:tcPr>
+          <w:p>
+            <w:pPr>
+              <w:spacing w:after="20" w:before="20"/>
+            </w:pPr>
+            <w:r>
+              <w:rPr>
+                <w:sz w:val="13"/>
+              </w:rPr>
+              <w:t>200 OK</w:t>
+            </w:r>
+          </w:p>
+        </w:tc>
+        <w:tc>
+          <w:tcPr>
+            <w:tcW w:type="dxa" w:w="1502"/>
+            <w:shd w:fill="FFFFFF"/>
+          </w:tcPr>
+          <w:p>
+            <w:pPr>
+              <w:spacing w:after="20" w:before="20"/>
+            </w:pPr>
+            <w:r>
+              <w:rPr>
+                <w:sz w:val="13"/>
+              </w:rPr>
+              <w:t>401, 403, 422</w:t>
+            </w:r>
+          </w:p>
+        </w:tc>
+      </w:tr>
+      <w:tr>
+        <w:tc>
+          <w:tcPr>
+            <w:tcW w:type="dxa" w:w="1502"/>
+            <w:shd w:fill="F8FAFC"/>
+          </w:tcPr>
+          <w:p>
+            <w:pPr>
+              <w:spacing w:after="20" w:before="20"/>
+            </w:pPr>
+            <w:r>
+              <w:rPr>
+                <w:sz w:val="13"/>
+              </w:rPr>
+              <w:t>30</w:t>
+            </w:r>
+          </w:p>
+        </w:tc>
+        <w:tc>
+          <w:tcPr>
+            <w:tcW w:type="dxa" w:w="1502"/>
+            <w:shd w:fill="F8FAFC"/>
+          </w:tcPr>
+          <w:p>
+            <w:pPr>
+              <w:spacing w:after="20" w:before="20"/>
+            </w:pPr>
+            <w:r>
+              <w:rPr>
+                <w:sz w:val="13"/>
+              </w:rPr>
+              <w:t>GET</w:t>
+            </w:r>
+          </w:p>
+        </w:tc>
+        <w:tc>
+          <w:tcPr>
+            <w:tcW w:type="dxa" w:w="1502"/>
+            <w:shd w:fill="F8FAFC"/>
+          </w:tcPr>
+          <w:p>
+            <w:pPr>
+              <w:spacing w:after="20" w:before="20"/>
+            </w:pPr>
+            <w:r>
+              <w:rPr>
+                <w:sz w:val="13"/>
+              </w:rPr>
+              <w:t>/admin/users</w:t>
+            </w:r>
+          </w:p>
+        </w:tc>
+        <w:tc>
+          <w:tcPr>
+            <w:tcW w:type="dxa" w:w="1502"/>
+            <w:shd w:fill="F8FAFC"/>
+          </w:tcPr>
+          <w:p>
+            <w:pPr>
+              <w:spacing w:after="20" w:before="20"/>
+            </w:pPr>
+            <w:r>
+              <w:rPr>
+                <w:sz w:val="13"/>
+              </w:rPr>
+              <w:t>Daftar seluruh akun pengguna platform (filter role &amp; status)</w:t>
+            </w:r>
+          </w:p>
+        </w:tc>
+        <w:tc>
+          <w:tcPr>
+            <w:tcW w:type="dxa" w:w="1502"/>
+            <w:shd w:fill="F8FAFC"/>
+          </w:tcPr>
+          <w:p>
+            <w:pPr>
+              <w:spacing w:after="20" w:before="20"/>
+            </w:pPr>
+            <w:r>
+              <w:rPr>
+                <w:sz w:val="13"/>
+              </w:rPr>
+              <w:t>Admin</w:t>
+            </w:r>
+          </w:p>
+        </w:tc>
+        <w:tc>
+          <w:tcPr>
+            <w:tcW w:type="dxa" w:w="1502"/>
+            <w:shd w:fill="F8FAFC"/>
+          </w:tcPr>
+          <w:p>
+            <w:pPr>
+              <w:spacing w:after="20" w:before="20"/>
+            </w:pPr>
+            <w:r>
+              <w:rPr>
+                <w:sz w:val="13"/>
+              </w:rPr>
+              <w:t>200 OK</w:t>
+            </w:r>
+          </w:p>
+        </w:tc>
+        <w:tc>
+          <w:tcPr>
+            <w:tcW w:type="dxa" w:w="1502"/>
+            <w:shd w:fill="F8FAFC"/>
+          </w:tcPr>
+          <w:p>
+            <w:pPr>
+              <w:spacing w:after="20" w:before="20"/>
+            </w:pPr>
+            <w:r>
+              <w:rPr>
+                <w:sz w:val="13"/>
+              </w:rPr>
+              <w:t>401, 403</w:t>
+            </w:r>
+          </w:p>
+        </w:tc>
+      </w:tr>
+      <w:tr>
+        <w:tc>
+          <w:tcPr>
+            <w:tcW w:type="dxa" w:w="1502"/>
+            <w:shd w:fill="FFFFFF"/>
+          </w:tcPr>
+          <w:p>
+            <w:pPr>
+              <w:spacing w:after="20" w:before="20"/>
+            </w:pPr>
+            <w:r>
+              <w:rPr>
+                <w:sz w:val="13"/>
+              </w:rPr>
+              <w:t>31</w:t>
+            </w:r>
+          </w:p>
+        </w:tc>
+        <w:tc>
+          <w:tcPr>
+            <w:tcW w:type="dxa" w:w="1502"/>
+            <w:shd w:fill="FFFFFF"/>
+          </w:tcPr>
+          <w:p>
+            <w:pPr>
+              <w:spacing w:after="20" w:before="20"/>
+            </w:pPr>
+            <w:r>
+              <w:rPr>
+                <w:sz w:val="13"/>
+              </w:rPr>
+              <w:t>PATCH</w:t>
+            </w:r>
+          </w:p>
+        </w:tc>
+        <w:tc>
+          <w:tcPr>
+            <w:tcW w:type="dxa" w:w="1502"/>
+            <w:shd w:fill="FFFFFF"/>
+          </w:tcPr>
+          <w:p>
+            <w:pPr>
+              <w:spacing w:after="20" w:before="20"/>
+            </w:pPr>
+            <w:r>
+              <w:rPr>
+                <w:sz w:val="13"/>
+              </w:rPr>
+              <w:t>/admin/users/{id}/verify</w:t>
+            </w:r>
+          </w:p>
+        </w:tc>
+        <w:tc>
+          <w:tcPr>
+            <w:tcW w:type="dxa" w:w="1502"/>
+            <w:shd w:fill="FFFFFF"/>
+          </w:tcPr>
+          <w:p>
+            <w:pPr>
+              <w:spacing w:after="20" w:before="20"/>
+            </w:pPr>
+            <w:r>
+              <w:rPr>
+                <w:sz w:val="13"/>
+              </w:rPr>
+              <w:t>Verifikasi dan aktivasi kemitraan akun pengelola baru</w:t>
+            </w:r>
+          </w:p>
+        </w:tc>
+        <w:tc>
+          <w:tcPr>
+            <w:tcW w:type="dxa" w:w="1502"/>
+            <w:shd w:fill="FFFFFF"/>
+          </w:tcPr>
+          <w:p>
+            <w:pPr>
+              <w:spacing w:after="20" w:before="20"/>
+            </w:pPr>
+            <w:r>
+              <w:rPr>
+                <w:sz w:val="13"/>
+              </w:rPr>
+              <w:t>Admin</w:t>
+            </w:r>
+          </w:p>
+        </w:tc>
+        <w:tc>
+          <w:tcPr>
+            <w:tcW w:type="dxa" w:w="1502"/>
+            <w:shd w:fill="FFFFFF"/>
+          </w:tcPr>
+          <w:p>
+            <w:pPr>
+              <w:spacing w:after="20" w:before="20"/>
+            </w:pPr>
+            <w:r>
+              <w:rPr>
+                <w:sz w:val="13"/>
+              </w:rPr>
+              <w:t>200 OK</w:t>
+            </w:r>
+          </w:p>
+        </w:tc>
+        <w:tc>
+          <w:tcPr>
+            <w:tcW w:type="dxa" w:w="1502"/>
+            <w:shd w:fill="FFFFFF"/>
+          </w:tcPr>
+          <w:p>
+            <w:pPr>
+              <w:spacing w:after="20" w:before="20"/>
+            </w:pPr>
+            <w:r>
+              <w:rPr>
+                <w:sz w:val="13"/>
               </w:rPr>
               <w:t>401, 403, 404</w:t>
             </w:r>
@@ -4886,7 +5993,7 @@
               <w:rPr>
                 <w:sz w:val="15"/>
               </w:rPr>
-              <w:t>Seluruh endpoint memakai kata benda jamak (/venues, /courts, /bookings, /payments). Tidak ada kata kerja seperti /getVenues atau /createBooking.</w:t>
+              <w:t>Seluruh endpoint memakai kata benda jamak (/venues, /courts, /prices, /blocks, /bookings, /payments). Tidak ada kata kerja seperti /getVenues atau /createBooking.</w:t>
             </w:r>
           </w:p>
         </w:tc>
@@ -5466,7 +6573,7 @@
         <w:br/>
         <w:t>• Aksi Pembayaran DP (POST /bookings/{id}/payments): Sub-resource pembayaran dengan Midtrans Snap &amp; callback webhook idempotent.</w:t>
         <w:br/>
-        <w:t>• PUT vs PATCH: Keduanya didukung pada /manage/courts/{id}. PUT untuk replace utuh, PATCH untuk mutasi parsial (status is_active).</w:t>
+        <w:t>• PUT vs PATCH: Keduanya didukung pada /manage/courts/{id} dan /manage/venues/{id}. PUT untuk replace utuh, PATCH untuk mutasi parsial.</w:t>
         <w:br/>
         <w:t>• Versioning: Prefix /api/v1 untuk proteksi kontrak jangka panjang tanpa merusak client lawas.</w:t>
       </w:r>

</xml_diff>

<commit_message>
docs: reconcile design document attributes with database ERD schema (resolve peer review feedback)
</commit_message>
<xml_diff>
--- a/Tugas_Minggu_4_Workshop_Desain_REST_API_Kelompok_3.docx
+++ b/Tugas_Minggu_4_Workshop_Desain_REST_API_Kelompok_3.docx
@@ -213,7 +213,7 @@
           <w:color w:val="1E3A8A"/>
           <w:sz w:val="22"/>
         </w:rPr>
-        <w:t>20.1 Aktivitas 1 – Pemodelan Resource (Koreksi &amp; Sinkronisasi Total)</w:t>
+        <w:t>20.1 Aktivitas 1 – Pemodelan Resource (Koreksi &amp; Sinkronisasi ERD)</w:t>
       </w:r>
     </w:p>
     <w:tbl>
@@ -517,7 +517,7 @@
               <w:rPr>
                 <w:sz w:val="14"/>
               </w:rPr>
-              <w:t>id, owner_id, name, slug, address, city, phone, dp_percent, cancel_free_hours, cancel_refund_percent, is_active</w:t>
+              <w:t>id, owner_id, name, slug, description, address, city, phone, dp_percent, cancel_free_hours, cancel_refund_percent, image_url</w:t>
             </w:r>
           </w:p>
         </w:tc>
@@ -729,7 +729,7 @@
               <w:rPr>
                 <w:sz w:val="14"/>
               </w:rPr>
-              <w:t>id, court_id, day_type, start_time, end_time, price</w:t>
+              <w:t>id, court_id, day_type, start_time, end_time, price, created_at</w:t>
             </w:r>
           </w:p>
         </w:tc>
@@ -1145,7 +1145,7 @@
               <w:rPr>
                 <w:sz w:val="14"/>
               </w:rPr>
-              <w:t>id, code, user_id, court_id, total_price, dp_amount, status, expires_at, cancelled_at, refund_amount</w:t>
+              <w:t>id, code, user_id, court_id, total_price, dp_amount, status, expires_at, cancelled_at, refund_amount (tgl main via booking_slots)</w:t>
             </w:r>
           </w:p>
         </w:tc>
@@ -2215,7 +2215,7 @@
               <w:rPr>
                 <w:sz w:val="13"/>
               </w:rPr>
-              <w:t>Katalog venue mitra dengan filter city, sport_type, q</w:t>
+              <w:t>Katalog venue mitra dengan filter city, sport, min/max price</w:t>
             </w:r>
           </w:p>
         </w:tc>
@@ -2578,7 +2578,7 @@
               <w:rPr>
                 <w:sz w:val="13"/>
               </w:rPr>
-              <w:t>Detail spesifikasi teknis lapangan fisik</w:t>
+              <w:t>Detail lapangan fisik (nama, cabang olahraga, status is_active)</w:t>
             </w:r>
           </w:p>
         </w:tc>
@@ -3909,7 +3909,7 @@
               <w:rPr>
                 <w:sz w:val="13"/>
               </w:rPr>
-              <w:t>Memperbarui profil venue secara menyeluruh</w:t>
+              <w:t>Memperbarui profil venue secara menyeluruh (alamat, DP/refund)</w:t>
             </w:r>
           </w:p>
         </w:tc>
@@ -4393,7 +4393,7 @@
               <w:rPr>
                 <w:sz w:val="13"/>
               </w:rPr>
-              <w:t>Mengubah status aktif/non-aktif lapangan parsial</w:t>
+              <w:t>Mengubah status aktif/non-aktif lapangan parsial (is_active)</w:t>
             </w:r>
           </w:p>
         </w:tc>
@@ -5574,7 +5574,7 @@
               <w:rPr>
                 <w:sz w:val="15"/>
               </w:rPr>
-              <w:t>city, sport_type, is_active, min_price, max_price</w:t>
+              <w:t>city, sport, min_price, max_price (via courts.courtPrices)</w:t>
             </w:r>
           </w:p>
         </w:tc>
@@ -5610,7 +5610,7 @@
               </w:rPr>
               <w:t>Default: name</w:t>
               <w:br/>
-              <w:t>Whitelist: name, -name, created_at, -created_at, starting_price, -starting_price</w:t>
+              <w:t>Whitelist: name, -name, created_at, -created_at, starting_price*, -starting_price* (*agregasi MIN(price))</w:t>
             </w:r>
           </w:p>
         </w:tc>
@@ -5667,7 +5667,7 @@
               <w:rPr>
                 <w:sz w:val="15"/>
               </w:rPr>
-              <w:t>status, court_id, date_from, date_to</w:t>
+              <w:t>status, court_id, date_from*, date_to* (*via booking_slots.slot_start)</w:t>
             </w:r>
           </w:p>
         </w:tc>
@@ -5703,7 +5703,7 @@
               </w:rPr>
               <w:t>Default: -created_at</w:t>
               <w:br/>
-              <w:t>Whitelist: created_at, -created_at, play_date, -play_date, total_price</w:t>
+              <w:t>Whitelist: created_at, -created_at, total_price, -total_price, expires_at, -expires_at</w:t>
             </w:r>
           </w:p>
         </w:tc>
@@ -6413,7 +6413,7 @@
               <w:rPr>
                 <w:sz w:val="15"/>
               </w:rPr>
-              <w:t>Filter dan sort dioperasikan di query string dengan whitelist ketat untuk mencegah SQL error atau pembocoran kolom sensitif.</w:t>
+              <w:t>Filter dan sort dioperasikan di query string dengan whitelist ketat yang selaras kolom fisik ERD untuk mencegah SQL error atau pembocoran kolom sensitif.</w:t>
             </w:r>
           </w:p>
         </w:tc>

</xml_diff>

<commit_message>
docs: add comprehensive HTTP status code handling glossary and architectural guide (5-page PDF & DOCX)
</commit_message>
<xml_diff>
--- a/Tugas_Minggu_4_Workshop_Desain_REST_API_Kelompok_3.docx
+++ b/Tugas_Minggu_4_Workshop_Desain_REST_API_Kelompok_3.docx
@@ -6484,6 +6484,1176 @@
                 <w:sz w:val="15"/>
               </w:rPr>
               <w:t>Seluruh skenario kegagalan memakai amplop format seragam: { status: 'error', message: '...', errors: { ... } }.</w:t>
+            </w:r>
+          </w:p>
+        </w:tc>
+      </w:tr>
+    </w:tbl>
+    <w:p>
+      <w:r>
+        <w:br w:type="page"/>
+      </w:r>
+    </w:p>
+    <w:p>
+      <w:r>
+        <w:rPr>
+          <w:b/>
+          <w:color w:val="1E3A8A"/>
+          <w:sz w:val="22"/>
+        </w:rPr>
+        <w:t>Kamus &amp; Panduan Lengkap HTTP Status Code Handling (RFC 9110)</w:t>
+      </w:r>
+    </w:p>
+    <w:tbl>
+      <w:tblPr>
+        <w:tblW w:type="auto" w:w="0"/>
+        <w:jc w:val="center"/>
+        <w:tblLook w:firstColumn="1" w:firstRow="1" w:lastColumn="0" w:lastRow="0" w:noHBand="0" w:noVBand="1" w:val="04A0"/>
+      </w:tblPr>
+      <w:tblGrid>
+        <w:gridCol w:w="2102"/>
+        <w:gridCol w:w="2102"/>
+        <w:gridCol w:w="2102"/>
+        <w:gridCol w:w="2102"/>
+        <w:gridCol w:w="2102"/>
+      </w:tblGrid>
+      <w:tr>
+        <w:tc>
+          <w:tcPr>
+            <w:tcW w:type="dxa" w:w="2102"/>
+            <w:shd w:fill="1E3A8A"/>
+          </w:tcPr>
+          <w:p>
+            <w:pPr>
+              <w:spacing w:after="20" w:before="20"/>
+            </w:pPr>
+            <w:r>
+              <w:rPr>
+                <w:b/>
+                <w:color w:val="FFFFFF"/>
+                <w:sz w:val="13"/>
+              </w:rPr>
+              <w:t>Kode</w:t>
+            </w:r>
+          </w:p>
+        </w:tc>
+        <w:tc>
+          <w:tcPr>
+            <w:tcW w:type="dxa" w:w="2102"/>
+            <w:shd w:fill="1E3A8A"/>
+          </w:tcPr>
+          <w:p>
+            <w:pPr>
+              <w:spacing w:after="20" w:before="20"/>
+            </w:pPr>
+            <w:r>
+              <w:rPr>
+                <w:b/>
+                <w:color w:val="FFFFFF"/>
+                <w:sz w:val="13"/>
+              </w:rPr>
+              <w:t>Kategori</w:t>
+            </w:r>
+          </w:p>
+        </w:tc>
+        <w:tc>
+          <w:tcPr>
+            <w:tcW w:type="dxa" w:w="2102"/>
+            <w:shd w:fill="1E3A8A"/>
+          </w:tcPr>
+          <w:p>
+            <w:pPr>
+              <w:spacing w:after="20" w:before="20"/>
+            </w:pPr>
+            <w:r>
+              <w:rPr>
+                <w:b/>
+                <w:color w:val="FFFFFF"/>
+                <w:sz w:val="13"/>
+              </w:rPr>
+              <w:t>Arti Standar (RFC 9110)</w:t>
+            </w:r>
+          </w:p>
+        </w:tc>
+        <w:tc>
+          <w:tcPr>
+            <w:tcW w:type="dxa" w:w="2102"/>
+            <w:shd w:fill="1E3A8A"/>
+          </w:tcPr>
+          <w:p>
+            <w:pPr>
+              <w:spacing w:after="20" w:before="20"/>
+            </w:pPr>
+            <w:r>
+              <w:rPr>
+                <w:b/>
+                <w:color w:val="FFFFFF"/>
+                <w:sz w:val="13"/>
+              </w:rPr>
+              <w:t>Konteks Penggunaan pada SportVenue</w:t>
+            </w:r>
+          </w:p>
+        </w:tc>
+        <w:tc>
+          <w:tcPr>
+            <w:tcW w:type="dxa" w:w="2102"/>
+            <w:shd w:fill="1E3A8A"/>
+          </w:tcPr>
+          <w:p>
+            <w:pPr>
+              <w:spacing w:after="20" w:before="20"/>
+            </w:pPr>
+            <w:r>
+              <w:rPr>
+                <w:b/>
+                <w:color w:val="FFFFFF"/>
+                <w:sz w:val="13"/>
+              </w:rPr>
+              <w:t>Karakteristik Response</w:t>
+            </w:r>
+          </w:p>
+        </w:tc>
+      </w:tr>
+      <w:tr>
+        <w:tc>
+          <w:tcPr>
+            <w:tcW w:type="dxa" w:w="2102"/>
+            <w:shd w:fill="FFFFFF"/>
+          </w:tcPr>
+          <w:p>
+            <w:pPr>
+              <w:spacing w:after="20" w:before="20"/>
+            </w:pPr>
+            <w:r>
+              <w:rPr>
+                <w:sz w:val="13"/>
+              </w:rPr>
+              <w:t>200 OK</w:t>
+            </w:r>
+          </w:p>
+        </w:tc>
+        <w:tc>
+          <w:tcPr>
+            <w:tcW w:type="dxa" w:w="2102"/>
+            <w:shd w:fill="FFFFFF"/>
+          </w:tcPr>
+          <w:p>
+            <w:pPr>
+              <w:spacing w:after="20" w:before="20"/>
+            </w:pPr>
+            <w:r>
+              <w:rPr>
+                <w:sz w:val="13"/>
+              </w:rPr>
+              <w:t>2xx Success</w:t>
+            </w:r>
+          </w:p>
+        </w:tc>
+        <w:tc>
+          <w:tcPr>
+            <w:tcW w:type="dxa" w:w="2102"/>
+            <w:shd w:fill="FFFFFF"/>
+          </w:tcPr>
+          <w:p>
+            <w:pPr>
+              <w:spacing w:after="20" w:before="20"/>
+            </w:pPr>
+            <w:r>
+              <w:rPr>
+                <w:sz w:val="13"/>
+              </w:rPr>
+              <w:t>Request berhasil diproses</w:t>
+            </w:r>
+          </w:p>
+        </w:tc>
+        <w:tc>
+          <w:tcPr>
+            <w:tcW w:type="dxa" w:w="2102"/>
+            <w:shd w:fill="FFFFFF"/>
+          </w:tcPr>
+          <w:p>
+            <w:pPr>
+              <w:spacing w:after="20" w:before="20"/>
+            </w:pPr>
+            <w:r>
+              <w:rPr>
+                <w:sz w:val="13"/>
+              </w:rPr>
+              <w:t>GET katalog venue/court, PUT/PATCH update, refund sewa</w:t>
+            </w:r>
+          </w:p>
+        </w:tc>
+        <w:tc>
+          <w:tcPr>
+            <w:tcW w:type="dxa" w:w="2102"/>
+            <w:shd w:fill="FFFFFF"/>
+          </w:tcPr>
+          <w:p>
+            <w:pPr>
+              <w:spacing w:after="20" w:before="20"/>
+            </w:pPr>
+            <w:r>
+              <w:rPr>
+                <w:sz w:val="13"/>
+              </w:rPr>
+              <w:t>{ status: 'success', data: { ... } }</w:t>
+            </w:r>
+          </w:p>
+        </w:tc>
+      </w:tr>
+      <w:tr>
+        <w:tc>
+          <w:tcPr>
+            <w:tcW w:type="dxa" w:w="2102"/>
+            <w:shd w:fill="F8FAFC"/>
+          </w:tcPr>
+          <w:p>
+            <w:pPr>
+              <w:spacing w:after="20" w:before="20"/>
+            </w:pPr>
+            <w:r>
+              <w:rPr>
+                <w:sz w:val="13"/>
+              </w:rPr>
+              <w:t>201 Created</w:t>
+            </w:r>
+          </w:p>
+        </w:tc>
+        <w:tc>
+          <w:tcPr>
+            <w:tcW w:type="dxa" w:w="2102"/>
+            <w:shd w:fill="F8FAFC"/>
+          </w:tcPr>
+          <w:p>
+            <w:pPr>
+              <w:spacing w:after="20" w:before="20"/>
+            </w:pPr>
+            <w:r>
+              <w:rPr>
+                <w:sz w:val="13"/>
+              </w:rPr>
+              <w:t>2xx Success</w:t>
+            </w:r>
+          </w:p>
+        </w:tc>
+        <w:tc>
+          <w:tcPr>
+            <w:tcW w:type="dxa" w:w="2102"/>
+            <w:shd w:fill="F8FAFC"/>
+          </w:tcPr>
+          <w:p>
+            <w:pPr>
+              <w:spacing w:after="20" w:before="20"/>
+            </w:pPr>
+            <w:r>
+              <w:rPr>
+                <w:sz w:val="13"/>
+              </w:rPr>
+              <w:t>Resource baru berhasil dibuat</w:t>
+            </w:r>
+          </w:p>
+        </w:tc>
+        <w:tc>
+          <w:tcPr>
+            <w:tcW w:type="dxa" w:w="2102"/>
+            <w:shd w:fill="F8FAFC"/>
+          </w:tcPr>
+          <w:p>
+            <w:pPr>
+              <w:spacing w:after="20" w:before="20"/>
+            </w:pPr>
+            <w:r>
+              <w:rPr>
+                <w:sz w:val="13"/>
+              </w:rPr>
+              <w:t>POST register, POST booking baru, POST court, POST payment</w:t>
+            </w:r>
+          </w:p>
+        </w:tc>
+        <w:tc>
+          <w:tcPr>
+            <w:tcW w:type="dxa" w:w="2102"/>
+            <w:shd w:fill="F8FAFC"/>
+          </w:tcPr>
+          <w:p>
+            <w:pPr>
+              <w:spacing w:after="20" w:before="20"/>
+            </w:pPr>
+            <w:r>
+              <w:rPr>
+                <w:sz w:val="13"/>
+              </w:rPr>
+              <w:t>Header Location + representasi data baru</w:t>
+            </w:r>
+          </w:p>
+        </w:tc>
+      </w:tr>
+      <w:tr>
+        <w:tc>
+          <w:tcPr>
+            <w:tcW w:type="dxa" w:w="2102"/>
+            <w:shd w:fill="FFFFFF"/>
+          </w:tcPr>
+          <w:p>
+            <w:pPr>
+              <w:spacing w:after="20" w:before="20"/>
+            </w:pPr>
+            <w:r>
+              <w:rPr>
+                <w:sz w:val="13"/>
+              </w:rPr>
+              <w:t>204 No Content</w:t>
+            </w:r>
+          </w:p>
+        </w:tc>
+        <w:tc>
+          <w:tcPr>
+            <w:tcW w:type="dxa" w:w="2102"/>
+            <w:shd w:fill="FFFFFF"/>
+          </w:tcPr>
+          <w:p>
+            <w:pPr>
+              <w:spacing w:after="20" w:before="20"/>
+            </w:pPr>
+            <w:r>
+              <w:rPr>
+                <w:sz w:val="13"/>
+              </w:rPr>
+              <w:t>2xx Success</w:t>
+            </w:r>
+          </w:p>
+        </w:tc>
+        <w:tc>
+          <w:tcPr>
+            <w:tcW w:type="dxa" w:w="2102"/>
+            <w:shd w:fill="FFFFFF"/>
+          </w:tcPr>
+          <w:p>
+            <w:pPr>
+              <w:spacing w:after="20" w:before="20"/>
+            </w:pPr>
+            <w:r>
+              <w:rPr>
+                <w:sz w:val="13"/>
+              </w:rPr>
+              <w:t>Operasi tuntas tanpa body</w:t>
+            </w:r>
+          </w:p>
+        </w:tc>
+        <w:tc>
+          <w:tcPr>
+            <w:tcW w:type="dxa" w:w="2102"/>
+            <w:shd w:fill="FFFFFF"/>
+          </w:tcPr>
+          <w:p>
+            <w:pPr>
+              <w:spacing w:after="20" w:before="20"/>
+            </w:pPr>
+            <w:r>
+              <w:rPr>
+                <w:sz w:val="13"/>
+              </w:rPr>
+              <w:t>DELETE lapangan, DELETE blokir, POST logout revokasi token</w:t>
+            </w:r>
+          </w:p>
+        </w:tc>
+        <w:tc>
+          <w:tcPr>
+            <w:tcW w:type="dxa" w:w="2102"/>
+            <w:shd w:fill="FFFFFF"/>
+          </w:tcPr>
+          <w:p>
+            <w:pPr>
+              <w:spacing w:after="20" w:before="20"/>
+            </w:pPr>
+            <w:r>
+              <w:rPr>
+                <w:sz w:val="13"/>
+              </w:rPr>
+              <w:t>Tanpa body (0 byte payload jaringan)</w:t>
+            </w:r>
+          </w:p>
+        </w:tc>
+      </w:tr>
+      <w:tr>
+        <w:tc>
+          <w:tcPr>
+            <w:tcW w:type="dxa" w:w="2102"/>
+            <w:shd w:fill="F8FAFC"/>
+          </w:tcPr>
+          <w:p>
+            <w:pPr>
+              <w:spacing w:after="20" w:before="20"/>
+            </w:pPr>
+            <w:r>
+              <w:rPr>
+                <w:sz w:val="13"/>
+              </w:rPr>
+              <w:t>400 Bad Request</w:t>
+            </w:r>
+          </w:p>
+        </w:tc>
+        <w:tc>
+          <w:tcPr>
+            <w:tcW w:type="dxa" w:w="2102"/>
+            <w:shd w:fill="F8FAFC"/>
+          </w:tcPr>
+          <w:p>
+            <w:pPr>
+              <w:spacing w:after="20" w:before="20"/>
+            </w:pPr>
+            <w:r>
+              <w:rPr>
+                <w:sz w:val="13"/>
+              </w:rPr>
+              <w:t>4xx Client</w:t>
+            </w:r>
+          </w:p>
+        </w:tc>
+        <w:tc>
+          <w:tcPr>
+            <w:tcW w:type="dxa" w:w="2102"/>
+            <w:shd w:fill="F8FAFC"/>
+          </w:tcPr>
+          <w:p>
+            <w:pPr>
+              <w:spacing w:after="20" w:before="20"/>
+            </w:pPr>
+            <w:r>
+              <w:rPr>
+                <w:sz w:val="13"/>
+              </w:rPr>
+              <w:t>Sintaks request rusak</w:t>
+            </w:r>
+          </w:p>
+        </w:tc>
+        <w:tc>
+          <w:tcPr>
+            <w:tcW w:type="dxa" w:w="2102"/>
+            <w:shd w:fill="F8FAFC"/>
+          </w:tcPr>
+          <w:p>
+            <w:pPr>
+              <w:spacing w:after="20" w:before="20"/>
+            </w:pPr>
+            <w:r>
+              <w:rPr>
+                <w:sz w:val="13"/>
+              </w:rPr>
+              <w:t>Payload JSON rusak (kurung kurawal tidak tutup, sintaks error)</w:t>
+            </w:r>
+          </w:p>
+        </w:tc>
+        <w:tc>
+          <w:tcPr>
+            <w:tcW w:type="dxa" w:w="2102"/>
+            <w:shd w:fill="F8FAFC"/>
+          </w:tcPr>
+          <w:p>
+            <w:pPr>
+              <w:spacing w:after="20" w:before="20"/>
+            </w:pPr>
+            <w:r>
+              <w:rPr>
+                <w:sz w:val="13"/>
+              </w:rPr>
+              <w:t>{ status: 'error', message: 'Malformed JSON' }</w:t>
+            </w:r>
+          </w:p>
+        </w:tc>
+      </w:tr>
+      <w:tr>
+        <w:tc>
+          <w:tcPr>
+            <w:tcW w:type="dxa" w:w="2102"/>
+            <w:shd w:fill="FFFFFF"/>
+          </w:tcPr>
+          <w:p>
+            <w:pPr>
+              <w:spacing w:after="20" w:before="20"/>
+            </w:pPr>
+            <w:r>
+              <w:rPr>
+                <w:sz w:val="13"/>
+              </w:rPr>
+              <w:t>401 Unauthorized</w:t>
+            </w:r>
+          </w:p>
+        </w:tc>
+        <w:tc>
+          <w:tcPr>
+            <w:tcW w:type="dxa" w:w="2102"/>
+            <w:shd w:fill="FFFFFF"/>
+          </w:tcPr>
+          <w:p>
+            <w:pPr>
+              <w:spacing w:after="20" w:before="20"/>
+            </w:pPr>
+            <w:r>
+              <w:rPr>
+                <w:sz w:val="13"/>
+              </w:rPr>
+              <w:t>4xx Client</w:t>
+            </w:r>
+          </w:p>
+        </w:tc>
+        <w:tc>
+          <w:tcPr>
+            <w:tcW w:type="dxa" w:w="2102"/>
+            <w:shd w:fill="FFFFFF"/>
+          </w:tcPr>
+          <w:p>
+            <w:pPr>
+              <w:spacing w:after="20" w:before="20"/>
+            </w:pPr>
+            <w:r>
+              <w:rPr>
+                <w:sz w:val="13"/>
+              </w:rPr>
+              <w:t>Autentikasi tidak valid</w:t>
+            </w:r>
+          </w:p>
+        </w:tc>
+        <w:tc>
+          <w:tcPr>
+            <w:tcW w:type="dxa" w:w="2102"/>
+            <w:shd w:fill="FFFFFF"/>
+          </w:tcPr>
+          <w:p>
+            <w:pPr>
+              <w:spacing w:after="20" w:before="20"/>
+            </w:pPr>
+            <w:r>
+              <w:rPr>
+                <w:sz w:val="13"/>
+              </w:rPr>
+              <w:t>Tanpa Bearer token, token Sanctum expired, salah login</w:t>
+            </w:r>
+          </w:p>
+        </w:tc>
+        <w:tc>
+          <w:tcPr>
+            <w:tcW w:type="dxa" w:w="2102"/>
+            <w:shd w:fill="FFFFFF"/>
+          </w:tcPr>
+          <w:p>
+            <w:pPr>
+              <w:spacing w:after="20" w:before="20"/>
+            </w:pPr>
+            <w:r>
+              <w:rPr>
+                <w:sz w:val="13"/>
+              </w:rPr>
+              <w:t>{ status: 'error', message: 'Unauthenticated' }</w:t>
+            </w:r>
+          </w:p>
+        </w:tc>
+      </w:tr>
+      <w:tr>
+        <w:tc>
+          <w:tcPr>
+            <w:tcW w:type="dxa" w:w="2102"/>
+            <w:shd w:fill="F8FAFC"/>
+          </w:tcPr>
+          <w:p>
+            <w:pPr>
+              <w:spacing w:after="20" w:before="20"/>
+            </w:pPr>
+            <w:r>
+              <w:rPr>
+                <w:sz w:val="13"/>
+              </w:rPr>
+              <w:t>403 Forbidden</w:t>
+            </w:r>
+          </w:p>
+        </w:tc>
+        <w:tc>
+          <w:tcPr>
+            <w:tcW w:type="dxa" w:w="2102"/>
+            <w:shd w:fill="F8FAFC"/>
+          </w:tcPr>
+          <w:p>
+            <w:pPr>
+              <w:spacing w:after="20" w:before="20"/>
+            </w:pPr>
+            <w:r>
+              <w:rPr>
+                <w:sz w:val="13"/>
+              </w:rPr>
+              <w:t>4xx Client</w:t>
+            </w:r>
+          </w:p>
+        </w:tc>
+        <w:tc>
+          <w:tcPr>
+            <w:tcW w:type="dxa" w:w="2102"/>
+            <w:shd w:fill="F8FAFC"/>
+          </w:tcPr>
+          <w:p>
+            <w:pPr>
+              <w:spacing w:after="20" w:before="20"/>
+            </w:pPr>
+            <w:r>
+              <w:rPr>
+                <w:sz w:val="13"/>
+              </w:rPr>
+              <w:t>Otorisasi ditolak (tidak berhak)</w:t>
+            </w:r>
+          </w:p>
+        </w:tc>
+        <w:tc>
+          <w:tcPr>
+            <w:tcW w:type="dxa" w:w="2102"/>
+            <w:shd w:fill="F8FAFC"/>
+          </w:tcPr>
+          <w:p>
+            <w:pPr>
+              <w:spacing w:after="20" w:before="20"/>
+            </w:pPr>
+            <w:r>
+              <w:rPr>
+                <w:sz w:val="13"/>
+              </w:rPr>
+              <w:t>Penyewa akses /manage/*, edit venue orang lain, HMAC palsu</w:t>
+            </w:r>
+          </w:p>
+        </w:tc>
+        <w:tc>
+          <w:tcPr>
+            <w:tcW w:type="dxa" w:w="2102"/>
+            <w:shd w:fill="F8FAFC"/>
+          </w:tcPr>
+          <w:p>
+            <w:pPr>
+              <w:spacing w:after="20" w:before="20"/>
+            </w:pPr>
+            <w:r>
+              <w:rPr>
+                <w:sz w:val="13"/>
+              </w:rPr>
+              <w:t>{ status: 'error', message: 'Akses ditolak' }</w:t>
+            </w:r>
+          </w:p>
+        </w:tc>
+      </w:tr>
+      <w:tr>
+        <w:tc>
+          <w:tcPr>
+            <w:tcW w:type="dxa" w:w="2102"/>
+            <w:shd w:fill="FFFFFF"/>
+          </w:tcPr>
+          <w:p>
+            <w:pPr>
+              <w:spacing w:after="20" w:before="20"/>
+            </w:pPr>
+            <w:r>
+              <w:rPr>
+                <w:sz w:val="13"/>
+              </w:rPr>
+              <w:t>404 Not Found</w:t>
+            </w:r>
+          </w:p>
+        </w:tc>
+        <w:tc>
+          <w:tcPr>
+            <w:tcW w:type="dxa" w:w="2102"/>
+            <w:shd w:fill="FFFFFF"/>
+          </w:tcPr>
+          <w:p>
+            <w:pPr>
+              <w:spacing w:after="20" w:before="20"/>
+            </w:pPr>
+            <w:r>
+              <w:rPr>
+                <w:sz w:val="13"/>
+              </w:rPr>
+              <w:t>4xx Client</w:t>
+            </w:r>
+          </w:p>
+        </w:tc>
+        <w:tc>
+          <w:tcPr>
+            <w:tcW w:type="dxa" w:w="2102"/>
+            <w:shd w:fill="FFFFFF"/>
+          </w:tcPr>
+          <w:p>
+            <w:pPr>
+              <w:spacing w:after="20" w:before="20"/>
+            </w:pPr>
+            <w:r>
+              <w:rPr>
+                <w:sz w:val="13"/>
+              </w:rPr>
+              <w:t>Resource tidak ada di sistem</w:t>
+            </w:r>
+          </w:p>
+        </w:tc>
+        <w:tc>
+          <w:tcPr>
+            <w:tcW w:type="dxa" w:w="2102"/>
+            <w:shd w:fill="FFFFFF"/>
+          </w:tcPr>
+          <w:p>
+            <w:pPr>
+              <w:spacing w:after="20" w:before="20"/>
+            </w:pPr>
+            <w:r>
+              <w:rPr>
+                <w:sz w:val="13"/>
+              </w:rPr>
+              <w:t>ID venue/court/booking tidak terdaftar di database MySQL</w:t>
+            </w:r>
+          </w:p>
+        </w:tc>
+        <w:tc>
+          <w:tcPr>
+            <w:tcW w:type="dxa" w:w="2102"/>
+            <w:shd w:fill="FFFFFF"/>
+          </w:tcPr>
+          <w:p>
+            <w:pPr>
+              <w:spacing w:after="20" w:before="20"/>
+            </w:pPr>
+            <w:r>
+              <w:rPr>
+                <w:sz w:val="13"/>
+              </w:rPr>
+              <w:t>{ status: 'error', message: 'Not Found' }</w:t>
+            </w:r>
+          </w:p>
+        </w:tc>
+      </w:tr>
+      <w:tr>
+        <w:tc>
+          <w:tcPr>
+            <w:tcW w:type="dxa" w:w="2102"/>
+            <w:shd w:fill="F8FAFC"/>
+          </w:tcPr>
+          <w:p>
+            <w:pPr>
+              <w:spacing w:after="20" w:before="20"/>
+            </w:pPr>
+            <w:r>
+              <w:rPr>
+                <w:sz w:val="13"/>
+              </w:rPr>
+              <w:t>409 Conflict</w:t>
+            </w:r>
+          </w:p>
+        </w:tc>
+        <w:tc>
+          <w:tcPr>
+            <w:tcW w:type="dxa" w:w="2102"/>
+            <w:shd w:fill="F8FAFC"/>
+          </w:tcPr>
+          <w:p>
+            <w:pPr>
+              <w:spacing w:after="20" w:before="20"/>
+            </w:pPr>
+            <w:r>
+              <w:rPr>
+                <w:sz w:val="13"/>
+              </w:rPr>
+              <w:t>4xx Client</w:t>
+            </w:r>
+          </w:p>
+        </w:tc>
+        <w:tc>
+          <w:tcPr>
+            <w:tcW w:type="dxa" w:w="2102"/>
+            <w:shd w:fill="F8FAFC"/>
+          </w:tcPr>
+          <w:p>
+            <w:pPr>
+              <w:spacing w:after="20" w:before="20"/>
+            </w:pPr>
+            <w:r>
+              <w:rPr>
+                <w:sz w:val="13"/>
+              </w:rPr>
+              <w:t>Bentrok dengan state database</w:t>
+            </w:r>
+          </w:p>
+        </w:tc>
+        <w:tc>
+          <w:tcPr>
+            <w:tcW w:type="dxa" w:w="2102"/>
+            <w:shd w:fill="F8FAFC"/>
+          </w:tcPr>
+          <w:p>
+            <w:pPr>
+              <w:spacing w:after="20" w:before="20"/>
+            </w:pPr>
+            <w:r>
+              <w:rPr>
+                <w:sz w:val="13"/>
+              </w:rPr>
+              <w:t>Anti double booking (slot terkunci), booking expired dibatalkan</w:t>
+            </w:r>
+          </w:p>
+        </w:tc>
+        <w:tc>
+          <w:tcPr>
+            <w:tcW w:type="dxa" w:w="2102"/>
+            <w:shd w:fill="F8FAFC"/>
+          </w:tcPr>
+          <w:p>
+            <w:pPr>
+              <w:spacing w:after="20" w:before="20"/>
+            </w:pPr>
+            <w:r>
+              <w:rPr>
+                <w:sz w:val="13"/>
+              </w:rPr>
+              <w:t>{ code: 'SLOT_ALREADY_LOCKED', message: '...' }</w:t>
+            </w:r>
+          </w:p>
+        </w:tc>
+      </w:tr>
+      <w:tr>
+        <w:tc>
+          <w:tcPr>
+            <w:tcW w:type="dxa" w:w="2102"/>
+            <w:shd w:fill="FFFFFF"/>
+          </w:tcPr>
+          <w:p>
+            <w:pPr>
+              <w:spacing w:after="20" w:before="20"/>
+            </w:pPr>
+            <w:r>
+              <w:rPr>
+                <w:sz w:val="13"/>
+              </w:rPr>
+              <w:t>422 Unprocessable</w:t>
+            </w:r>
+          </w:p>
+        </w:tc>
+        <w:tc>
+          <w:tcPr>
+            <w:tcW w:type="dxa" w:w="2102"/>
+            <w:shd w:fill="FFFFFF"/>
+          </w:tcPr>
+          <w:p>
+            <w:pPr>
+              <w:spacing w:after="20" w:before="20"/>
+            </w:pPr>
+            <w:r>
+              <w:rPr>
+                <w:sz w:val="13"/>
+              </w:rPr>
+              <w:t>4xx Client</w:t>
+            </w:r>
+          </w:p>
+        </w:tc>
+        <w:tc>
+          <w:tcPr>
+            <w:tcW w:type="dxa" w:w="2102"/>
+            <w:shd w:fill="FFFFFF"/>
+          </w:tcPr>
+          <w:p>
+            <w:pPr>
+              <w:spacing w:after="20" w:before="20"/>
+            </w:pPr>
+            <w:r>
+              <w:rPr>
+                <w:sz w:val="13"/>
+              </w:rPr>
+              <w:t>Isi melanggar validasi bisnis</w:t>
+            </w:r>
+          </w:p>
+        </w:tc>
+        <w:tc>
+          <w:tcPr>
+            <w:tcW w:type="dxa" w:w="2102"/>
+            <w:shd w:fill="FFFFFF"/>
+          </w:tcPr>
+          <w:p>
+            <w:pPr>
+              <w:spacing w:after="20" w:before="20"/>
+            </w:pPr>
+            <w:r>
+              <w:rPr>
+                <w:sz w:val="13"/>
+              </w:rPr>
+              <w:t>Slot kosong, tanggal bukan YYYY-MM-DD, email duplikat</w:t>
+            </w:r>
+          </w:p>
+        </w:tc>
+        <w:tc>
+          <w:tcPr>
+            <w:tcW w:type="dxa" w:w="2102"/>
+            <w:shd w:fill="FFFFFF"/>
+          </w:tcPr>
+          <w:p>
+            <w:pPr>
+              <w:spacing w:after="20" w:before="20"/>
+            </w:pPr>
+            <w:r>
+              <w:rPr>
+                <w:sz w:val="13"/>
+              </w:rPr>
+              <w:t>{ errors: { field: ['detail pesan error'] } }</w:t>
+            </w:r>
+          </w:p>
+        </w:tc>
+      </w:tr>
+      <w:tr>
+        <w:tc>
+          <w:tcPr>
+            <w:tcW w:type="dxa" w:w="2102"/>
+            <w:shd w:fill="F8FAFC"/>
+          </w:tcPr>
+          <w:p>
+            <w:pPr>
+              <w:spacing w:after="20" w:before="20"/>
+            </w:pPr>
+            <w:r>
+              <w:rPr>
+                <w:sz w:val="13"/>
+              </w:rPr>
+              <w:t>429 Too Many Req</w:t>
+            </w:r>
+          </w:p>
+        </w:tc>
+        <w:tc>
+          <w:tcPr>
+            <w:tcW w:type="dxa" w:w="2102"/>
+            <w:shd w:fill="F8FAFC"/>
+          </w:tcPr>
+          <w:p>
+            <w:pPr>
+              <w:spacing w:after="20" w:before="20"/>
+            </w:pPr>
+            <w:r>
+              <w:rPr>
+                <w:sz w:val="13"/>
+              </w:rPr>
+              <w:t>4xx Client</w:t>
+            </w:r>
+          </w:p>
+        </w:tc>
+        <w:tc>
+          <w:tcPr>
+            <w:tcW w:type="dxa" w:w="2102"/>
+            <w:shd w:fill="F8FAFC"/>
+          </w:tcPr>
+          <w:p>
+            <w:pPr>
+              <w:spacing w:after="20" w:before="20"/>
+            </w:pPr>
+            <w:r>
+              <w:rPr>
+                <w:sz w:val="13"/>
+              </w:rPr>
+              <w:t>Melebihi kuota rate limit</w:t>
+            </w:r>
+          </w:p>
+        </w:tc>
+        <w:tc>
+          <w:tcPr>
+            <w:tcW w:type="dxa" w:w="2102"/>
+            <w:shd w:fill="F8FAFC"/>
+          </w:tcPr>
+          <w:p>
+            <w:pPr>
+              <w:spacing w:after="20" w:before="20"/>
+            </w:pPr>
+            <w:r>
+              <w:rPr>
+                <w:sz w:val="13"/>
+              </w:rPr>
+              <w:t>Spam booking, brute-force login (&gt; 60 request/menit)</w:t>
+            </w:r>
+          </w:p>
+        </w:tc>
+        <w:tc>
+          <w:tcPr>
+            <w:tcW w:type="dxa" w:w="2102"/>
+            <w:shd w:fill="F8FAFC"/>
+          </w:tcPr>
+          <w:p>
+            <w:pPr>
+              <w:spacing w:after="20" w:before="20"/>
+            </w:pPr>
+            <w:r>
+              <w:rPr>
+                <w:sz w:val="13"/>
+              </w:rPr>
+              <w:t>Header Retry-After: 60 + pesan penolakan</w:t>
+            </w:r>
+          </w:p>
+        </w:tc>
+      </w:tr>
+      <w:tr>
+        <w:tc>
+          <w:tcPr>
+            <w:tcW w:type="dxa" w:w="2102"/>
+            <w:shd w:fill="FFFFFF"/>
+          </w:tcPr>
+          <w:p>
+            <w:pPr>
+              <w:spacing w:after="20" w:before="20"/>
+            </w:pPr>
+            <w:r>
+              <w:rPr>
+                <w:sz w:val="13"/>
+              </w:rPr>
+              <w:t>500 Server Error</w:t>
+            </w:r>
+          </w:p>
+        </w:tc>
+        <w:tc>
+          <w:tcPr>
+            <w:tcW w:type="dxa" w:w="2102"/>
+            <w:shd w:fill="FFFFFF"/>
+          </w:tcPr>
+          <w:p>
+            <w:pPr>
+              <w:spacing w:after="20" w:before="20"/>
+            </w:pPr>
+            <w:r>
+              <w:rPr>
+                <w:sz w:val="13"/>
+              </w:rPr>
+              <w:t>5xx Server</w:t>
+            </w:r>
+          </w:p>
+        </w:tc>
+        <w:tc>
+          <w:tcPr>
+            <w:tcW w:type="dxa" w:w="2102"/>
+            <w:shd w:fill="FFFFFF"/>
+          </w:tcPr>
+          <w:p>
+            <w:pPr>
+              <w:spacing w:after="20" w:before="20"/>
+            </w:pPr>
+            <w:r>
+              <w:rPr>
+                <w:sz w:val="13"/>
+              </w:rPr>
+              <w:t>Kegagalan internal tak terduga</w:t>
+            </w:r>
+          </w:p>
+        </w:tc>
+        <w:tc>
+          <w:tcPr>
+            <w:tcW w:type="dxa" w:w="2102"/>
+            <w:shd w:fill="FFFFFF"/>
+          </w:tcPr>
+          <w:p>
+            <w:pPr>
+              <w:spacing w:after="20" w:before="20"/>
+            </w:pPr>
+            <w:r>
+              <w:rPr>
+                <w:sz w:val="13"/>
+              </w:rPr>
+              <w:t>Koneksi database MySQL terputus, fatal exception runtime</w:t>
+            </w:r>
+          </w:p>
+        </w:tc>
+        <w:tc>
+          <w:tcPr>
+            <w:tcW w:type="dxa" w:w="2102"/>
+            <w:shd w:fill="FFFFFF"/>
+          </w:tcPr>
+          <w:p>
+            <w:pPr>
+              <w:spacing w:after="20" w:before="20"/>
+            </w:pPr>
+            <w:r>
+              <w:rPr>
+                <w:sz w:val="13"/>
+              </w:rPr>
+              <w:t>Pesan umum, tanpa stack trace</w:t>
+            </w:r>
+          </w:p>
+        </w:tc>
+      </w:tr>
+      <w:tr>
+        <w:tc>
+          <w:tcPr>
+            <w:tcW w:type="dxa" w:w="2102"/>
+            <w:shd w:fill="F8FAFC"/>
+          </w:tcPr>
+          <w:p>
+            <w:pPr>
+              <w:spacing w:after="20" w:before="20"/>
+            </w:pPr>
+            <w:r>
+              <w:rPr>
+                <w:sz w:val="13"/>
+              </w:rPr>
+              <w:t>503 Unavailable</w:t>
+            </w:r>
+          </w:p>
+        </w:tc>
+        <w:tc>
+          <w:tcPr>
+            <w:tcW w:type="dxa" w:w="2102"/>
+            <w:shd w:fill="F8FAFC"/>
+          </w:tcPr>
+          <w:p>
+            <w:pPr>
+              <w:spacing w:after="20" w:before="20"/>
+            </w:pPr>
+            <w:r>
+              <w:rPr>
+                <w:sz w:val="13"/>
+              </w:rPr>
+              <w:t>5xx Server</w:t>
+            </w:r>
+          </w:p>
+        </w:tc>
+        <w:tc>
+          <w:tcPr>
+            <w:tcW w:type="dxa" w:w="2102"/>
+            <w:shd w:fill="F8FAFC"/>
+          </w:tcPr>
+          <w:p>
+            <w:pPr>
+              <w:spacing w:after="20" w:before="20"/>
+            </w:pPr>
+            <w:r>
+              <w:rPr>
+                <w:sz w:val="13"/>
+              </w:rPr>
+              <w:t>Layanan upstream/gateway down</w:t>
+            </w:r>
+          </w:p>
+        </w:tc>
+        <w:tc>
+          <w:tcPr>
+            <w:tcW w:type="dxa" w:w="2102"/>
+            <w:shd w:fill="F8FAFC"/>
+          </w:tcPr>
+          <w:p>
+            <w:pPr>
+              <w:spacing w:after="20" w:before="20"/>
+            </w:pPr>
+            <w:r>
+              <w:rPr>
+                <w:sz w:val="13"/>
+              </w:rPr>
+              <w:t>API Midtrans payment gateway down/maintenance saat token</w:t>
+            </w:r>
+          </w:p>
+        </w:tc>
+        <w:tc>
+          <w:tcPr>
+            <w:tcW w:type="dxa" w:w="2102"/>
+            <w:shd w:fill="F8FAFC"/>
+          </w:tcPr>
+          <w:p>
+            <w:pPr>
+              <w:spacing w:after="20" w:before="20"/>
+            </w:pPr>
+            <w:r>
+              <w:rPr>
+                <w:sz w:val="13"/>
+              </w:rPr>
+              <w:t>Pesan gateway sibuk, coba kembali</w:t>
             </w:r>
           </w:p>
         </w:tc>

</xml_diff>